<commit_message>
Actualiza diario individual de Jorge - Fase 2
</commit_message>
<xml_diff>
--- a/Fase 2/Evidencias Individuales/Soto_Jorge_2.1_APT122_DiarioReflexionFase2.docx
+++ b/Fase 2/Evidencias Individuales/Soto_Jorge_2.1_APT122_DiarioReflexionFase2.docx
@@ -1,6 +1,6 @@
 
 <file path=word/document.xml><?xml version="1.0" encoding="utf-8"?>
-<w:document xmlns:wpc="http://schemas.microsoft.com/office/word/2010/wordprocessingCanvas" xmlns:cx="http://schemas.microsoft.com/office/drawing/2014/chartex" xmlns:mc="http://schemas.openxmlformats.org/markup-compatibility/2006" xmlns:o="urn:schemas-microsoft-com:office:office" xmlns:r="http://schemas.openxmlformats.org/officeDocument/2006/relationships" xmlns:m="http://schemas.openxmlformats.org/officeDocument/2006/math" xmlns:v="urn:schemas-microsoft-com:vml" xmlns:wp14="http://schemas.microsoft.com/office/word/2010/wordprocessingDrawing" xmlns:wp="http://schemas.openxmlformats.org/drawingml/2006/wordprocessingDrawing" xmlns:w10="urn:schemas-microsoft-com:office:word" xmlns:w="http://schemas.openxmlformats.org/wordprocessingml/2006/main" xmlns:w14="http://schemas.microsoft.com/office/word/2010/wordml" xmlns:w15="http://schemas.microsoft.com/office/word/2012/wordml" xmlns:w16se="http://schemas.microsoft.com/office/word/2015/wordml/symex" xmlns:wpg="http://schemas.microsoft.com/office/word/2010/wordprocessingGroup" xmlns:wpi="http://schemas.microsoft.com/office/word/2010/wordprocessingInk" xmlns:wne="http://schemas.microsoft.com/office/word/2006/wordml" xmlns:wps="http://schemas.microsoft.com/office/word/2010/wordprocessingShape" mc:Ignorable="w14 w15 w16se wp14">
+<w:document xmlns:wpc="http://schemas.microsoft.com/office/word/2010/wordprocessingCanvas" xmlns:cx="http://schemas.microsoft.com/office/drawing/2014/chartex" xmlns:cx1="http://schemas.microsoft.com/office/drawing/2015/9/8/chartex" xmlns:cx2="http://schemas.microsoft.com/office/drawing/2015/10/21/chartex" xmlns:cx3="http://schemas.microsoft.com/office/drawing/2016/5/9/chartex" xmlns:cx4="http://schemas.microsoft.com/office/drawing/2016/5/10/chartex" xmlns:cx5="http://schemas.microsoft.com/office/drawing/2016/5/11/chartex" xmlns:cx6="http://schemas.microsoft.com/office/drawing/2016/5/12/chartex" xmlns:cx7="http://schemas.microsoft.com/office/drawing/2016/5/13/chartex" xmlns:cx8="http://schemas.microsoft.com/office/drawing/2016/5/14/chartex" xmlns:mc="http://schemas.openxmlformats.org/markup-compatibility/2006" xmlns:aink="http://schemas.microsoft.com/office/drawing/2016/ink" xmlns:am3d="http://schemas.microsoft.com/office/drawing/2017/model3d" xmlns:o="urn:schemas-microsoft-com:office:office" xmlns:oel="http://schemas.microsoft.com/office/2019/extlst" xmlns:r="http://schemas.openxmlformats.org/officeDocument/2006/relationships" xmlns:m="http://schemas.openxmlformats.org/officeDocument/2006/math" xmlns:v="urn:schemas-microsoft-com:vml" xmlns:wp14="http://schemas.microsoft.com/office/word/2010/wordprocessingDrawing" xmlns:wp="http://schemas.openxmlformats.org/drawingml/2006/wordprocessingDrawing" xmlns:w10="urn:schemas-microsoft-com:office:word" xmlns:w="http://schemas.openxmlformats.org/wordprocessingml/2006/main" xmlns:w14="http://schemas.microsoft.com/office/word/2010/wordml" xmlns:w15="http://schemas.microsoft.com/office/word/2012/wordml" xmlns:w16cex="http://schemas.microsoft.com/office/word/2018/wordml/cex" xmlns:w16cid="http://schemas.microsoft.com/office/word/2016/wordml/cid" xmlns:w16="http://schemas.microsoft.com/office/word/2018/wordml" xmlns:w16du="http://schemas.microsoft.com/office/word/2023/wordml/word16du" xmlns:w16sdtdh="http://schemas.microsoft.com/office/word/2020/wordml/sdtdatahash" xmlns:w16sdtfl="http://schemas.microsoft.com/office/word/2024/wordml/sdtformatlock" xmlns:w16se="http://schemas.microsoft.com/office/word/2015/wordml/symex" xmlns:wpg="http://schemas.microsoft.com/office/word/2010/wordprocessingGroup" xmlns:wpi="http://schemas.microsoft.com/office/word/2010/wordprocessingInk" xmlns:wne="http://schemas.microsoft.com/office/word/2006/wordml" xmlns:wps="http://schemas.microsoft.com/office/word/2010/wordprocessingShape" mc:Ignorable="w14 w15 w16se w16cid w16 w16cex w16sdtdh w16sdtfl w16du wp14">
   <w:body>
     <w:p/>
     <w:tbl>
@@ -286,7 +286,25 @@
                 <w:sz w:val="24"/>
                 <w:szCs w:val="24"/>
               </w:rPr>
-              <w:t>1. Mira tu carta Gantt y reflexiona sobre los avances de tu Proyecto APT</w:t>
+              <w:t xml:space="preserve">1. Mira </w:t>
+            </w:r>
+            <w:proofErr w:type="spellStart"/>
+            <w:r>
+              <w:rPr>
+                <w:rFonts w:eastAsiaTheme="majorEastAsia"/>
+                <w:sz w:val="24"/>
+                <w:szCs w:val="24"/>
+              </w:rPr>
+              <w:t>tu</w:t>
+            </w:r>
+            <w:proofErr w:type="spellEnd"/>
+            <w:r>
+              <w:rPr>
+                <w:rFonts w:eastAsiaTheme="majorEastAsia"/>
+                <w:sz w:val="24"/>
+                <w:szCs w:val="24"/>
+              </w:rPr>
+              <w:t xml:space="preserve"> carta Gantt y reflexiona sobre los avances de tu Proyecto APT</w:t>
             </w:r>
           </w:p>
         </w:tc>
@@ -317,19 +335,26 @@
                 <w:sz w:val="24"/>
                 <w:szCs w:val="24"/>
               </w:rPr>
-              <w:t>¿Has podido cumplir todas las actividades en los tiempos definidos? ¿Qué factores han facilitado o dificultado el desarrollo de las actividades de tu plan de trabajo?</w:t>
+              <w:t xml:space="preserve">Las funciones de código se desarrollaron dentro de los tiempos definidos. Algunas tareas complementarias de documentación y preparación de evidencias continúan en proceso según la planificación, por lo que no estamos contra el tiempo. Durante esta etapa trabajamos en levantar EduGestor con Docker y PostgreSQL, preparar documentos curriculares para el corpus RAG y probar su indexación y uso en la generación de pruebas. Nos ayudó contar con una plataforma base, documentos oficiales y coordinación mediante GitHub. En el proceso enfrentamos problemas de dependencias y configuración de contenedores, advertencias al procesar algunos PDF y una indisponibilidad temporal del servicio Gemini; los abordamos revisando registros, ajustando la configuración y retomando las pruebas.</w:t>
             </w:r>
-          </w:p>
-          <w:p>
-            <w:pPr>
-              <w:jc w:val="both"/>
+            <w:proofErr w:type="spellStart"/>
+            <w:r>
               <w:rPr>
                 <w:rFonts w:eastAsiaTheme="majorEastAsia"/>
-                <w:color w:val="767171" w:themeColor="background2" w:themeShade="80"/>
                 <w:sz w:val="24"/>
                 <w:szCs w:val="24"/>
               </w:rPr>
-            </w:pPr>
+              <w:t/>
+            </w:r>
+            <w:proofErr w:type="spellEnd"/>
+            <w:r>
+              <w:rPr>
+                <w:rFonts w:eastAsiaTheme="majorEastAsia"/>
+                <w:sz w:val="24"/>
+                <w:szCs w:val="24"/>
+              </w:rPr>
+              <w:t xml:space="preserve"/>
+            </w:r>
           </w:p>
           <w:p>
             <w:pPr>
@@ -441,10 +466,10 @@
             <w:pPr>
               <w:jc w:val="both"/>
               <w:rPr>
-                <w:rFonts w:eastAsiaTheme="majorEastAsia"/>
-                <w:color w:val="767171" w:themeColor="background2" w:themeShade="80"/>
-                <w:sz w:val="24"/>
-                <w:szCs w:val="24"/>
+                <w:rFonts w:ascii="Calibri" w:hAnsi="Calibri"/>
+                <w:b/>
+                <w:bCs/>
+                <w:color w:val="1F4E79" w:themeColor="accent1" w:themeShade="80"/>
               </w:rPr>
             </w:pPr>
             <w:r>
@@ -453,30 +478,8 @@
                 <w:sz w:val="24"/>
                 <w:szCs w:val="24"/>
               </w:rPr>
-              <w:t xml:space="preserve">¿De qué manera has enfrentado y/o planeas enfrentar las dificultades que han afectado el desarrollo de tu Proyecto APT? </w:t>
+              <w:t>Revisamos los registros de Docker y Django para identificar las causas, corregimos dependencias y configuración, reconstruimos la imagen del contenedor web cuando fue necesario y ajustamos el comando de indexación. También retomamos las pruebas cuando los servicios estuvieron disponibles. Para los problemas temporales de Gemini, es importante distinguir una caída del proveedor de un error propio del sistema y volver a probar después.</w:t>
             </w:r>
-          </w:p>
-          <w:p>
-            <w:pPr>
-              <w:jc w:val="both"/>
-              <w:rPr>
-                <w:rFonts w:ascii="Calibri" w:hAnsi="Calibri"/>
-                <w:b/>
-                <w:bCs/>
-                <w:color w:val="1F4E79" w:themeColor="accent1" w:themeShade="80"/>
-              </w:rPr>
-            </w:pPr>
-          </w:p>
-          <w:p>
-            <w:pPr>
-              <w:jc w:val="both"/>
-              <w:rPr>
-                <w:rFonts w:ascii="Calibri" w:hAnsi="Calibri"/>
-                <w:b/>
-                <w:bCs/>
-                <w:color w:val="1F4E79" w:themeColor="accent1" w:themeShade="80"/>
-              </w:rPr>
-            </w:pPr>
           </w:p>
           <w:p>
             <w:pPr>
@@ -673,10 +676,10 @@
             <w:pPr>
               <w:jc w:val="both"/>
               <w:rPr>
-                <w:rFonts w:eastAsiaTheme="majorEastAsia"/>
-                <w:color w:val="767171" w:themeColor="background2" w:themeShade="80"/>
-                <w:sz w:val="24"/>
-                <w:szCs w:val="24"/>
+                <w:rFonts w:ascii="Calibri" w:hAnsi="Calibri"/>
+                <w:b/>
+                <w:bCs/>
+                <w:color w:val="1F4E79" w:themeColor="accent1" w:themeShade="80"/>
               </w:rPr>
             </w:pPr>
             <w:r>
@@ -685,52 +688,8 @@
                 <w:sz w:val="24"/>
                 <w:szCs w:val="24"/>
               </w:rPr>
-              <w:lastRenderedPageBreak/>
-              <w:t>¿Cómo evalúas tu</w:t>
+              <w:t>Evalúo positivamente mi trabajo en la resolución de problemas y en la preparación y prueba del corpus curricular. Destaco la perseverancia para revisar errores, seguir el flujo de indexación y coordinar los cambios del proyecto. Para mejorar, necesito dejar cada prueba y sus resultados mejor documentados, anticipar más tiempo para validar y convertir las pruebas manuales repetidas en verificaciones más sistemáticas.</w:t>
             </w:r>
-            <w:r>
-              <w:rPr>
-                <w:rFonts w:eastAsiaTheme="majorEastAsia"/>
-                <w:sz w:val="24"/>
-                <w:szCs w:val="24"/>
-              </w:rPr>
-              <w:t xml:space="preserve"> trabajo</w:t>
-            </w:r>
-            <w:r>
-              <w:rPr>
-                <w:rFonts w:eastAsiaTheme="majorEastAsia"/>
-                <w:sz w:val="24"/>
-                <w:szCs w:val="24"/>
-              </w:rPr>
-              <w:t>? ¿Qué destacas y qué podrías hacer para mejorar tu</w:t>
-            </w:r>
-            <w:r>
-              <w:rPr>
-                <w:rFonts w:eastAsiaTheme="majorEastAsia"/>
-                <w:sz w:val="24"/>
-                <w:szCs w:val="24"/>
-              </w:rPr>
-              <w:t xml:space="preserve"> trabajo</w:t>
-            </w:r>
-            <w:r>
-              <w:rPr>
-                <w:rFonts w:eastAsiaTheme="majorEastAsia"/>
-                <w:sz w:val="24"/>
-                <w:szCs w:val="24"/>
-              </w:rPr>
-              <w:t xml:space="preserve">? </w:t>
-            </w:r>
-          </w:p>
-          <w:p>
-            <w:pPr>
-              <w:jc w:val="both"/>
-              <w:rPr>
-                <w:rFonts w:ascii="Calibri" w:hAnsi="Calibri"/>
-                <w:b/>
-                <w:bCs/>
-                <w:color w:val="1F4E79" w:themeColor="accent1" w:themeShade="80"/>
-              </w:rPr>
-            </w:pPr>
           </w:p>
           <w:p>
             <w:pPr>
@@ -843,10 +802,10 @@
             <w:pPr>
               <w:jc w:val="both"/>
               <w:rPr>
-                <w:rFonts w:eastAsiaTheme="majorEastAsia"/>
-                <w:color w:val="767171" w:themeColor="background2" w:themeShade="80"/>
-                <w:sz w:val="24"/>
-                <w:szCs w:val="24"/>
+                <w:rFonts w:ascii="Calibri" w:hAnsi="Calibri"/>
+                <w:b/>
+                <w:bCs/>
+                <w:color w:val="1F4E79" w:themeColor="accent1" w:themeShade="80"/>
               </w:rPr>
             </w:pPr>
             <w:r>
@@ -855,19 +814,8 @@
                 <w:sz w:val="24"/>
                 <w:szCs w:val="24"/>
               </w:rPr>
-              <w:t>¿Qué inquietudes te quedan sobre cómo proceder? ¿Qué pregunta te gustaría hacerle a tu docente o a tus pares?</w:t>
+              <w:t>Me gustaría confirmar con el docente qué evidencias se esperan para demostrar que el RAG recupera información pertinente y que las pruebas generadas se basan en los documentos indexados. También quisiera aclarar cómo se debe responder este diario: la pauta indica trabajo grupal, aunque el archivo esté a nombre de una persona. Finalmente, debemos mantener coherentes el alcance acordado para una institución por instalación y la documentación del sistema.</w:t>
             </w:r>
-          </w:p>
-          <w:p>
-            <w:pPr>
-              <w:jc w:val="both"/>
-              <w:rPr>
-                <w:rFonts w:ascii="Calibri" w:hAnsi="Calibri"/>
-                <w:b/>
-                <w:bCs/>
-                <w:color w:val="1F4E79" w:themeColor="accent1" w:themeShade="80"/>
-              </w:rPr>
-            </w:pPr>
           </w:p>
           <w:p>
             <w:pPr>
@@ -1014,19 +962,8 @@
                 <w:sz w:val="24"/>
                 <w:szCs w:val="24"/>
               </w:rPr>
-              <w:t>¿Consideran que las actividades deben ser redistribuidas entre los miembros del grupo? ¿Hay nuevas actividades que deban ser asignadas a algún miembro del grupo?</w:t>
+              <w:t xml:space="preserve">No consideramos necesario redistribuir las actividades ni asignar nuevas tareas a algún integrante. Cada persona es responsable de organizar sus tiempos y, hasta ahora, las funciones de código se han desarrollado de acuerdo con lo planificado. Como somos cuatro integrantes, hemos trabajado organizados en duplas, una distribución que nos ha permitido avanzar adecuadamente.</w:t>
             </w:r>
-          </w:p>
-          <w:p>
-            <w:pPr>
-              <w:jc w:val="both"/>
-              <w:rPr>
-                <w:rFonts w:eastAsiaTheme="majorEastAsia"/>
-                <w:color w:val="767171" w:themeColor="background2" w:themeShade="80"/>
-                <w:sz w:val="24"/>
-                <w:szCs w:val="24"/>
-              </w:rPr>
-            </w:pPr>
           </w:p>
           <w:p>
             <w:pPr>
@@ -1141,8 +1078,6 @@
               </w:rPr>
               <w:t>. APT  grupal</w:t>
             </w:r>
-            <w:bookmarkStart w:id="0" w:name="_GoBack"/>
-            <w:bookmarkEnd w:id="0"/>
           </w:p>
         </w:tc>
       </w:tr>
@@ -1164,6 +1099,7 @@
                 <w:color w:val="767171" w:themeColor="background2" w:themeShade="80"/>
                 <w:sz w:val="24"/>
                 <w:szCs w:val="24"/>
+                <w:u w:val="single"/>
               </w:rPr>
             </w:pPr>
             <w:r>
@@ -1172,19 +1108,9 @@
                 <w:sz w:val="24"/>
                 <w:szCs w:val="24"/>
               </w:rPr>
-              <w:t>¿Cómo evalúan el trabajo en grupo? ¿Qué aspectos positivos destacan? ¿Qué aspectos podrían mejorar?</w:t>
+              <w:lastRenderedPageBreak/>
+              <w:t xml:space="preserve">Como aspectos positivos, hemos compartido avances y colaborado para resolver problemas técnicos e integrar cambios. La organización en duplas y la responsabilidad de cada integrante sobre sus tiempos nos han permitido avanzar según lo planificado. Como oportunidad de mejora, podemos comunicar con claridad el progreso de las actividades y mantener la documentación y las evidencias actualizadas conforme validamos los avances, conservando la distribución de trabajo actual.</w:t>
             </w:r>
-          </w:p>
-          <w:p>
-            <w:pPr>
-              <w:jc w:val="both"/>
-              <w:rPr>
-                <w:rFonts w:eastAsiaTheme="majorEastAsia"/>
-                <w:color w:val="767171" w:themeColor="background2" w:themeShade="80"/>
-                <w:sz w:val="24"/>
-                <w:szCs w:val="24"/>
-              </w:rPr>
-            </w:pPr>
           </w:p>
           <w:p>
             <w:pPr>
@@ -1272,7 +1198,7 @@
 </file>
 
 <file path=word/endnotes.xml><?xml version="1.0" encoding="utf-8"?>
-<w:endnotes xmlns:wpc="http://schemas.microsoft.com/office/word/2010/wordprocessingCanvas" xmlns:cx="http://schemas.microsoft.com/office/drawing/2014/chartex" xmlns:mc="http://schemas.openxmlformats.org/markup-compatibility/2006" xmlns:o="urn:schemas-microsoft-com:office:office" xmlns:r="http://schemas.openxmlformats.org/officeDocument/2006/relationships" xmlns:m="http://schemas.openxmlformats.org/officeDocument/2006/math" xmlns:v="urn:schemas-microsoft-com:vml" xmlns:wp14="http://schemas.microsoft.com/office/word/2010/wordprocessingDrawing" xmlns:wp="http://schemas.openxmlformats.org/drawingml/2006/wordprocessingDrawing" xmlns:w10="urn:schemas-microsoft-com:office:word" xmlns:w="http://schemas.openxmlformats.org/wordprocessingml/2006/main" xmlns:w14="http://schemas.microsoft.com/office/word/2010/wordml" xmlns:w15="http://schemas.microsoft.com/office/word/2012/wordml" xmlns:w16se="http://schemas.microsoft.com/office/word/2015/wordml/symex" xmlns:wpg="http://schemas.microsoft.com/office/word/2010/wordprocessingGroup" xmlns:wpi="http://schemas.microsoft.com/office/word/2010/wordprocessingInk" xmlns:wne="http://schemas.microsoft.com/office/word/2006/wordml" xmlns:wps="http://schemas.microsoft.com/office/word/2010/wordprocessingShape" mc:Ignorable="w14 w15 w16se wp14">
+<w:endnotes xmlns:wpc="http://schemas.microsoft.com/office/word/2010/wordprocessingCanvas" xmlns:cx="http://schemas.microsoft.com/office/drawing/2014/chartex" xmlns:cx1="http://schemas.microsoft.com/office/drawing/2015/9/8/chartex" xmlns:cx2="http://schemas.microsoft.com/office/drawing/2015/10/21/chartex" xmlns:cx3="http://schemas.microsoft.com/office/drawing/2016/5/9/chartex" xmlns:cx4="http://schemas.microsoft.com/office/drawing/2016/5/10/chartex" xmlns:cx5="http://schemas.microsoft.com/office/drawing/2016/5/11/chartex" xmlns:cx6="http://schemas.microsoft.com/office/drawing/2016/5/12/chartex" xmlns:cx7="http://schemas.microsoft.com/office/drawing/2016/5/13/chartex" xmlns:cx8="http://schemas.microsoft.com/office/drawing/2016/5/14/chartex" xmlns:mc="http://schemas.openxmlformats.org/markup-compatibility/2006" xmlns:aink="http://schemas.microsoft.com/office/drawing/2016/ink" xmlns:am3d="http://schemas.microsoft.com/office/drawing/2017/model3d" xmlns:o="urn:schemas-microsoft-com:office:office" xmlns:oel="http://schemas.microsoft.com/office/2019/extlst" xmlns:r="http://schemas.openxmlformats.org/officeDocument/2006/relationships" xmlns:m="http://schemas.openxmlformats.org/officeDocument/2006/math" xmlns:v="urn:schemas-microsoft-com:vml" xmlns:wp14="http://schemas.microsoft.com/office/word/2010/wordprocessingDrawing" xmlns:wp="http://schemas.openxmlformats.org/drawingml/2006/wordprocessingDrawing" xmlns:w10="urn:schemas-microsoft-com:office:word" xmlns:w="http://schemas.openxmlformats.org/wordprocessingml/2006/main" xmlns:w14="http://schemas.microsoft.com/office/word/2010/wordml" xmlns:w15="http://schemas.microsoft.com/office/word/2012/wordml" xmlns:w16cex="http://schemas.microsoft.com/office/word/2018/wordml/cex" xmlns:w16cid="http://schemas.microsoft.com/office/word/2016/wordml/cid" xmlns:w16="http://schemas.microsoft.com/office/word/2018/wordml" xmlns:w16du="http://schemas.microsoft.com/office/word/2023/wordml/word16du" xmlns:w16sdtdh="http://schemas.microsoft.com/office/word/2020/wordml/sdtdatahash" xmlns:w16sdtfl="http://schemas.microsoft.com/office/word/2024/wordml/sdtformatlock" xmlns:w16se="http://schemas.microsoft.com/office/word/2015/wordml/symex" xmlns:wpg="http://schemas.microsoft.com/office/word/2010/wordprocessingGroup" xmlns:wpi="http://schemas.microsoft.com/office/word/2010/wordprocessingInk" xmlns:wne="http://schemas.microsoft.com/office/word/2006/wordml" xmlns:wps="http://schemas.microsoft.com/office/word/2010/wordprocessingShape" mc:Ignorable="w14 w15 w16se w16cid w16 w16cex w16sdtdh w16sdtfl w16du wp14">
   <w:endnote w:type="separator" w:id="-1">
     <w:p>
       <w:pPr>
@@ -1297,7 +1223,7 @@
 </file>
 
 <file path=word/footer1.xml><?xml version="1.0" encoding="utf-8"?>
-<w:ftr xmlns:wpc="http://schemas.microsoft.com/office/word/2010/wordprocessingCanvas" xmlns:cx="http://schemas.microsoft.com/office/drawing/2014/chartex" xmlns:mc="http://schemas.openxmlformats.org/markup-compatibility/2006" xmlns:o="urn:schemas-microsoft-com:office:office" xmlns:r="http://schemas.openxmlformats.org/officeDocument/2006/relationships" xmlns:m="http://schemas.openxmlformats.org/officeDocument/2006/math" xmlns:v="urn:schemas-microsoft-com:vml" xmlns:wp14="http://schemas.microsoft.com/office/word/2010/wordprocessingDrawing" xmlns:wp="http://schemas.openxmlformats.org/drawingml/2006/wordprocessingDrawing" xmlns:w10="urn:schemas-microsoft-com:office:word" xmlns:w="http://schemas.openxmlformats.org/wordprocessingml/2006/main" xmlns:w14="http://schemas.microsoft.com/office/word/2010/wordml" xmlns:w15="http://schemas.microsoft.com/office/word/2012/wordml" xmlns:w16se="http://schemas.microsoft.com/office/word/2015/wordml/symex" xmlns:wpg="http://schemas.microsoft.com/office/word/2010/wordprocessingGroup" xmlns:wpi="http://schemas.microsoft.com/office/word/2010/wordprocessingInk" xmlns:wne="http://schemas.microsoft.com/office/word/2006/wordml" xmlns:wps="http://schemas.microsoft.com/office/word/2010/wordprocessingShape" mc:Ignorable="w14 w15 w16se wp14">
+<w:ftr xmlns:wpc="http://schemas.microsoft.com/office/word/2010/wordprocessingCanvas" xmlns:cx="http://schemas.microsoft.com/office/drawing/2014/chartex" xmlns:cx1="http://schemas.microsoft.com/office/drawing/2015/9/8/chartex" xmlns:cx2="http://schemas.microsoft.com/office/drawing/2015/10/21/chartex" xmlns:cx3="http://schemas.microsoft.com/office/drawing/2016/5/9/chartex" xmlns:cx4="http://schemas.microsoft.com/office/drawing/2016/5/10/chartex" xmlns:cx5="http://schemas.microsoft.com/office/drawing/2016/5/11/chartex" xmlns:cx6="http://schemas.microsoft.com/office/drawing/2016/5/12/chartex" xmlns:cx7="http://schemas.microsoft.com/office/drawing/2016/5/13/chartex" xmlns:cx8="http://schemas.microsoft.com/office/drawing/2016/5/14/chartex" xmlns:mc="http://schemas.openxmlformats.org/markup-compatibility/2006" xmlns:aink="http://schemas.microsoft.com/office/drawing/2016/ink" xmlns:am3d="http://schemas.microsoft.com/office/drawing/2017/model3d" xmlns:o="urn:schemas-microsoft-com:office:office" xmlns:oel="http://schemas.microsoft.com/office/2019/extlst" xmlns:r="http://schemas.openxmlformats.org/officeDocument/2006/relationships" xmlns:m="http://schemas.openxmlformats.org/officeDocument/2006/math" xmlns:v="urn:schemas-microsoft-com:vml" xmlns:wp14="http://schemas.microsoft.com/office/word/2010/wordprocessingDrawing" xmlns:wp="http://schemas.openxmlformats.org/drawingml/2006/wordprocessingDrawing" xmlns:w10="urn:schemas-microsoft-com:office:word" xmlns:w="http://schemas.openxmlformats.org/wordprocessingml/2006/main" xmlns:w14="http://schemas.microsoft.com/office/word/2010/wordml" xmlns:w15="http://schemas.microsoft.com/office/word/2012/wordml" xmlns:w16cex="http://schemas.microsoft.com/office/word/2018/wordml/cex" xmlns:w16cid="http://schemas.microsoft.com/office/word/2016/wordml/cid" xmlns:w16="http://schemas.microsoft.com/office/word/2018/wordml" xmlns:w16du="http://schemas.microsoft.com/office/word/2023/wordml/word16du" xmlns:w16sdtdh="http://schemas.microsoft.com/office/word/2020/wordml/sdtdatahash" xmlns:w16sdtfl="http://schemas.microsoft.com/office/word/2024/wordml/sdtformatlock" xmlns:w16se="http://schemas.microsoft.com/office/word/2015/wordml/symex" xmlns:wpg="http://schemas.microsoft.com/office/word/2010/wordprocessingGroup" xmlns:wpi="http://schemas.microsoft.com/office/word/2010/wordprocessingInk" xmlns:wne="http://schemas.microsoft.com/office/word/2006/wordml" xmlns:wps="http://schemas.microsoft.com/office/word/2010/wordprocessingShape" mc:Ignorable="w14 w15 w16se w16cid w16 w16cex w16sdtdh w16sdtfl w16du wp14">
   <w:sdt>
     <w:sdtPr>
       <w:id w:val="-937982979"/>
@@ -1306,7 +1232,6 @@
         <w:docPartUnique/>
       </w:docPartObj>
     </w:sdtPr>
-    <w:sdtEndPr/>
     <w:sdtContent>
       <w:p>
         <w:pPr>
@@ -1585,7 +1510,7 @@
 </file>
 
 <file path=word/footnotes.xml><?xml version="1.0" encoding="utf-8"?>
-<w:footnotes xmlns:wpc="http://schemas.microsoft.com/office/word/2010/wordprocessingCanvas" xmlns:cx="http://schemas.microsoft.com/office/drawing/2014/chartex" xmlns:mc="http://schemas.openxmlformats.org/markup-compatibility/2006" xmlns:o="urn:schemas-microsoft-com:office:office" xmlns:r="http://schemas.openxmlformats.org/officeDocument/2006/relationships" xmlns:m="http://schemas.openxmlformats.org/officeDocument/2006/math" xmlns:v="urn:schemas-microsoft-com:vml" xmlns:wp14="http://schemas.microsoft.com/office/word/2010/wordprocessingDrawing" xmlns:wp="http://schemas.openxmlformats.org/drawingml/2006/wordprocessingDrawing" xmlns:w10="urn:schemas-microsoft-com:office:word" xmlns:w="http://schemas.openxmlformats.org/wordprocessingml/2006/main" xmlns:w14="http://schemas.microsoft.com/office/word/2010/wordml" xmlns:w15="http://schemas.microsoft.com/office/word/2012/wordml" xmlns:w16se="http://schemas.microsoft.com/office/word/2015/wordml/symex" xmlns:wpg="http://schemas.microsoft.com/office/word/2010/wordprocessingGroup" xmlns:wpi="http://schemas.microsoft.com/office/word/2010/wordprocessingInk" xmlns:wne="http://schemas.microsoft.com/office/word/2006/wordml" xmlns:wps="http://schemas.microsoft.com/office/word/2010/wordprocessingShape" mc:Ignorable="w14 w15 w16se wp14">
+<w:footnotes xmlns:wpc="http://schemas.microsoft.com/office/word/2010/wordprocessingCanvas" xmlns:cx="http://schemas.microsoft.com/office/drawing/2014/chartex" xmlns:cx1="http://schemas.microsoft.com/office/drawing/2015/9/8/chartex" xmlns:cx2="http://schemas.microsoft.com/office/drawing/2015/10/21/chartex" xmlns:cx3="http://schemas.microsoft.com/office/drawing/2016/5/9/chartex" xmlns:cx4="http://schemas.microsoft.com/office/drawing/2016/5/10/chartex" xmlns:cx5="http://schemas.microsoft.com/office/drawing/2016/5/11/chartex" xmlns:cx6="http://schemas.microsoft.com/office/drawing/2016/5/12/chartex" xmlns:cx7="http://schemas.microsoft.com/office/drawing/2016/5/13/chartex" xmlns:cx8="http://schemas.microsoft.com/office/drawing/2016/5/14/chartex" xmlns:mc="http://schemas.openxmlformats.org/markup-compatibility/2006" xmlns:aink="http://schemas.microsoft.com/office/drawing/2016/ink" xmlns:am3d="http://schemas.microsoft.com/office/drawing/2017/model3d" xmlns:o="urn:schemas-microsoft-com:office:office" xmlns:oel="http://schemas.microsoft.com/office/2019/extlst" xmlns:r="http://schemas.openxmlformats.org/officeDocument/2006/relationships" xmlns:m="http://schemas.openxmlformats.org/officeDocument/2006/math" xmlns:v="urn:schemas-microsoft-com:vml" xmlns:wp14="http://schemas.microsoft.com/office/word/2010/wordprocessingDrawing" xmlns:wp="http://schemas.openxmlformats.org/drawingml/2006/wordprocessingDrawing" xmlns:w10="urn:schemas-microsoft-com:office:word" xmlns:w="http://schemas.openxmlformats.org/wordprocessingml/2006/main" xmlns:w14="http://schemas.microsoft.com/office/word/2010/wordml" xmlns:w15="http://schemas.microsoft.com/office/word/2012/wordml" xmlns:w16cex="http://schemas.microsoft.com/office/word/2018/wordml/cex" xmlns:w16cid="http://schemas.microsoft.com/office/word/2016/wordml/cid" xmlns:w16="http://schemas.microsoft.com/office/word/2018/wordml" xmlns:w16du="http://schemas.microsoft.com/office/word/2023/wordml/word16du" xmlns:w16sdtdh="http://schemas.microsoft.com/office/word/2020/wordml/sdtdatahash" xmlns:w16sdtfl="http://schemas.microsoft.com/office/word/2024/wordml/sdtformatlock" xmlns:w16se="http://schemas.microsoft.com/office/word/2015/wordml/symex" xmlns:wpg="http://schemas.microsoft.com/office/word/2010/wordprocessingGroup" xmlns:wpi="http://schemas.microsoft.com/office/word/2010/wordprocessingInk" xmlns:wne="http://schemas.microsoft.com/office/word/2006/wordml" xmlns:wps="http://schemas.microsoft.com/office/word/2010/wordprocessingShape" mc:Ignorable="w14 w15 w16se w16cid w16 w16cex w16sdtdh w16sdtfl w16du wp14">
   <w:footnote w:type="separator" w:id="-1">
     <w:p>
       <w:pPr>
@@ -1610,7 +1535,7 @@
 </file>
 
 <file path=word/header1.xml><?xml version="1.0" encoding="utf-8"?>
-<w:hdr xmlns:wpc="http://schemas.microsoft.com/office/word/2010/wordprocessingCanvas" xmlns:cx="http://schemas.microsoft.com/office/drawing/2014/chartex" xmlns:mc="http://schemas.openxmlformats.org/markup-compatibility/2006" xmlns:o="urn:schemas-microsoft-com:office:office" xmlns:r="http://schemas.openxmlformats.org/officeDocument/2006/relationships" xmlns:m="http://schemas.openxmlformats.org/officeDocument/2006/math" xmlns:v="urn:schemas-microsoft-com:vml" xmlns:wp14="http://schemas.microsoft.com/office/word/2010/wordprocessingDrawing" xmlns:wp="http://schemas.openxmlformats.org/drawingml/2006/wordprocessingDrawing" xmlns:w10="urn:schemas-microsoft-com:office:word" xmlns:w="http://schemas.openxmlformats.org/wordprocessingml/2006/main" xmlns:w14="http://schemas.microsoft.com/office/word/2010/wordml" xmlns:w15="http://schemas.microsoft.com/office/word/2012/wordml" xmlns:w16se="http://schemas.microsoft.com/office/word/2015/wordml/symex" xmlns:wpg="http://schemas.microsoft.com/office/word/2010/wordprocessingGroup" xmlns:wpi="http://schemas.microsoft.com/office/word/2010/wordprocessingInk" xmlns:wne="http://schemas.microsoft.com/office/word/2006/wordml" xmlns:wps="http://schemas.microsoft.com/office/word/2010/wordprocessingShape" mc:Ignorable="w14 w15 w16se wp14">
+<w:hdr xmlns:wpc="http://schemas.microsoft.com/office/word/2010/wordprocessingCanvas" xmlns:cx="http://schemas.microsoft.com/office/drawing/2014/chartex" xmlns:cx1="http://schemas.microsoft.com/office/drawing/2015/9/8/chartex" xmlns:cx2="http://schemas.microsoft.com/office/drawing/2015/10/21/chartex" xmlns:cx3="http://schemas.microsoft.com/office/drawing/2016/5/9/chartex" xmlns:cx4="http://schemas.microsoft.com/office/drawing/2016/5/10/chartex" xmlns:cx5="http://schemas.microsoft.com/office/drawing/2016/5/11/chartex" xmlns:cx6="http://schemas.microsoft.com/office/drawing/2016/5/12/chartex" xmlns:cx7="http://schemas.microsoft.com/office/drawing/2016/5/13/chartex" xmlns:cx8="http://schemas.microsoft.com/office/drawing/2016/5/14/chartex" xmlns:mc="http://schemas.openxmlformats.org/markup-compatibility/2006" xmlns:aink="http://schemas.microsoft.com/office/drawing/2016/ink" xmlns:am3d="http://schemas.microsoft.com/office/drawing/2017/model3d" xmlns:o="urn:schemas-microsoft-com:office:office" xmlns:oel="http://schemas.microsoft.com/office/2019/extlst" xmlns:r="http://schemas.openxmlformats.org/officeDocument/2006/relationships" xmlns:m="http://schemas.openxmlformats.org/officeDocument/2006/math" xmlns:v="urn:schemas-microsoft-com:vml" xmlns:wp14="http://schemas.microsoft.com/office/word/2010/wordprocessingDrawing" xmlns:wp="http://schemas.openxmlformats.org/drawingml/2006/wordprocessingDrawing" xmlns:w10="urn:schemas-microsoft-com:office:word" xmlns:w="http://schemas.openxmlformats.org/wordprocessingml/2006/main" xmlns:w14="http://schemas.microsoft.com/office/word/2010/wordml" xmlns:w15="http://schemas.microsoft.com/office/word/2012/wordml" xmlns:w16cex="http://schemas.microsoft.com/office/word/2018/wordml/cex" xmlns:w16cid="http://schemas.microsoft.com/office/word/2016/wordml/cid" xmlns:w16="http://schemas.microsoft.com/office/word/2018/wordml" xmlns:w16du="http://schemas.microsoft.com/office/word/2023/wordml/word16du" xmlns:w16sdtdh="http://schemas.microsoft.com/office/word/2020/wordml/sdtdatahash" xmlns:w16sdtfl="http://schemas.microsoft.com/office/word/2024/wordml/sdtformatlock" xmlns:w16se="http://schemas.microsoft.com/office/word/2015/wordml/symex" xmlns:wpg="http://schemas.microsoft.com/office/word/2010/wordprocessingGroup" xmlns:wpi="http://schemas.microsoft.com/office/word/2010/wordprocessingInk" xmlns:wne="http://schemas.microsoft.com/office/word/2006/wordml" xmlns:wps="http://schemas.microsoft.com/office/word/2010/wordprocessingShape" mc:Ignorable="w14 w15 w16se w16cid w16 w16cex w16sdtdh w16sdtfl w16du wp14">
   <w:tbl>
     <w:tblPr>
       <w:tblStyle w:val="Tablaconcuadrcula"/>
@@ -1790,7 +1715,7 @@
 </file>
 
 <file path=word/header2.xml><?xml version="1.0" encoding="utf-8"?>
-<w:hdr xmlns:wpc="http://schemas.microsoft.com/office/word/2010/wordprocessingCanvas" xmlns:cx="http://schemas.microsoft.com/office/drawing/2014/chartex" xmlns:mc="http://schemas.openxmlformats.org/markup-compatibility/2006" xmlns:o="urn:schemas-microsoft-com:office:office" xmlns:r="http://schemas.openxmlformats.org/officeDocument/2006/relationships" xmlns:m="http://schemas.openxmlformats.org/officeDocument/2006/math" xmlns:v="urn:schemas-microsoft-com:vml" xmlns:wp14="http://schemas.microsoft.com/office/word/2010/wordprocessingDrawing" xmlns:wp="http://schemas.openxmlformats.org/drawingml/2006/wordprocessingDrawing" xmlns:w10="urn:schemas-microsoft-com:office:word" xmlns:w="http://schemas.openxmlformats.org/wordprocessingml/2006/main" xmlns:w14="http://schemas.microsoft.com/office/word/2010/wordml" xmlns:w15="http://schemas.microsoft.com/office/word/2012/wordml" xmlns:w16se="http://schemas.microsoft.com/office/word/2015/wordml/symex" xmlns:wpg="http://schemas.microsoft.com/office/word/2010/wordprocessingGroup" xmlns:wpi="http://schemas.microsoft.com/office/word/2010/wordprocessingInk" xmlns:wne="http://schemas.microsoft.com/office/word/2006/wordml" xmlns:wps="http://schemas.microsoft.com/office/word/2010/wordprocessingShape" mc:Ignorable="w14 w15 w16se wp14">
+<w:hdr xmlns:wpc="http://schemas.microsoft.com/office/word/2010/wordprocessingCanvas" xmlns:cx="http://schemas.microsoft.com/office/drawing/2014/chartex" xmlns:cx1="http://schemas.microsoft.com/office/drawing/2015/9/8/chartex" xmlns:cx2="http://schemas.microsoft.com/office/drawing/2015/10/21/chartex" xmlns:cx3="http://schemas.microsoft.com/office/drawing/2016/5/9/chartex" xmlns:cx4="http://schemas.microsoft.com/office/drawing/2016/5/10/chartex" xmlns:cx5="http://schemas.microsoft.com/office/drawing/2016/5/11/chartex" xmlns:cx6="http://schemas.microsoft.com/office/drawing/2016/5/12/chartex" xmlns:cx7="http://schemas.microsoft.com/office/drawing/2016/5/13/chartex" xmlns:cx8="http://schemas.microsoft.com/office/drawing/2016/5/14/chartex" xmlns:mc="http://schemas.openxmlformats.org/markup-compatibility/2006" xmlns:aink="http://schemas.microsoft.com/office/drawing/2016/ink" xmlns:am3d="http://schemas.microsoft.com/office/drawing/2017/model3d" xmlns:o="urn:schemas-microsoft-com:office:office" xmlns:oel="http://schemas.microsoft.com/office/2019/extlst" xmlns:r="http://schemas.openxmlformats.org/officeDocument/2006/relationships" xmlns:m="http://schemas.openxmlformats.org/officeDocument/2006/math" xmlns:v="urn:schemas-microsoft-com:vml" xmlns:wp14="http://schemas.microsoft.com/office/word/2010/wordprocessingDrawing" xmlns:wp="http://schemas.openxmlformats.org/drawingml/2006/wordprocessingDrawing" xmlns:w10="urn:schemas-microsoft-com:office:word" xmlns:w="http://schemas.openxmlformats.org/wordprocessingml/2006/main" xmlns:w14="http://schemas.microsoft.com/office/word/2010/wordml" xmlns:w15="http://schemas.microsoft.com/office/word/2012/wordml" xmlns:w16cex="http://schemas.microsoft.com/office/word/2018/wordml/cex" xmlns:w16cid="http://schemas.microsoft.com/office/word/2016/wordml/cid" xmlns:w16="http://schemas.microsoft.com/office/word/2018/wordml" xmlns:w16du="http://schemas.microsoft.com/office/word/2023/wordml/word16du" xmlns:w16sdtdh="http://schemas.microsoft.com/office/word/2020/wordml/sdtdatahash" xmlns:w16sdtfl="http://schemas.microsoft.com/office/word/2024/wordml/sdtformatlock" xmlns:w16se="http://schemas.microsoft.com/office/word/2015/wordml/symex" xmlns:wpg="http://schemas.microsoft.com/office/word/2010/wordprocessingGroup" xmlns:wpi="http://schemas.microsoft.com/office/word/2010/wordprocessingInk" xmlns:wne="http://schemas.microsoft.com/office/word/2006/wordml" xmlns:wps="http://schemas.microsoft.com/office/word/2010/wordprocessingShape" mc:Ignorable="w14 w15 w16se w16cid w16 w16cex w16sdtdh w16sdtfl w16du wp14">
   <w:tbl>
     <w:tblPr>
       <w:tblStyle w:val="Tablaconcuadrcula"/>
@@ -2065,7 +1990,7 @@
 </file>
 
 <file path=word/numbering.xml><?xml version="1.0" encoding="utf-8"?>
-<w:numbering xmlns:wpc="http://schemas.microsoft.com/office/word/2010/wordprocessingCanvas" xmlns:cx="http://schemas.microsoft.com/office/drawing/2014/chartex" xmlns:mc="http://schemas.openxmlformats.org/markup-compatibility/2006" xmlns:o="urn:schemas-microsoft-com:office:office" xmlns:r="http://schemas.openxmlformats.org/officeDocument/2006/relationships" xmlns:m="http://schemas.openxmlformats.org/officeDocument/2006/math" xmlns:v="urn:schemas-microsoft-com:vml" xmlns:wp14="http://schemas.microsoft.com/office/word/2010/wordprocessingDrawing" xmlns:wp="http://schemas.openxmlformats.org/drawingml/2006/wordprocessingDrawing" xmlns:w10="urn:schemas-microsoft-com:office:word" xmlns:w="http://schemas.openxmlformats.org/wordprocessingml/2006/main" xmlns:w14="http://schemas.microsoft.com/office/word/2010/wordml" xmlns:w15="http://schemas.microsoft.com/office/word/2012/wordml" xmlns:w16se="http://schemas.microsoft.com/office/word/2015/wordml/symex" xmlns:wpg="http://schemas.microsoft.com/office/word/2010/wordprocessingGroup" xmlns:wpi="http://schemas.microsoft.com/office/word/2010/wordprocessingInk" xmlns:wne="http://schemas.microsoft.com/office/word/2006/wordml" xmlns:wps="http://schemas.microsoft.com/office/word/2010/wordprocessingShape" mc:Ignorable="w14 w15 w16se wp14">
+<w:numbering xmlns:wpc="http://schemas.microsoft.com/office/word/2010/wordprocessingCanvas" xmlns:cx="http://schemas.microsoft.com/office/drawing/2014/chartex" xmlns:cx1="http://schemas.microsoft.com/office/drawing/2015/9/8/chartex" xmlns:cx2="http://schemas.microsoft.com/office/drawing/2015/10/21/chartex" xmlns:cx3="http://schemas.microsoft.com/office/drawing/2016/5/9/chartex" xmlns:cx4="http://schemas.microsoft.com/office/drawing/2016/5/10/chartex" xmlns:cx5="http://schemas.microsoft.com/office/drawing/2016/5/11/chartex" xmlns:cx6="http://schemas.microsoft.com/office/drawing/2016/5/12/chartex" xmlns:cx7="http://schemas.microsoft.com/office/drawing/2016/5/13/chartex" xmlns:cx8="http://schemas.microsoft.com/office/drawing/2016/5/14/chartex" xmlns:mc="http://schemas.openxmlformats.org/markup-compatibility/2006" xmlns:aink="http://schemas.microsoft.com/office/drawing/2016/ink" xmlns:am3d="http://schemas.microsoft.com/office/drawing/2017/model3d" xmlns:o="urn:schemas-microsoft-com:office:office" xmlns:oel="http://schemas.microsoft.com/office/2019/extlst" xmlns:r="http://schemas.openxmlformats.org/officeDocument/2006/relationships" xmlns:m="http://schemas.openxmlformats.org/officeDocument/2006/math" xmlns:v="urn:schemas-microsoft-com:vml" xmlns:wp14="http://schemas.microsoft.com/office/word/2010/wordprocessingDrawing" xmlns:wp="http://schemas.openxmlformats.org/drawingml/2006/wordprocessingDrawing" xmlns:w10="urn:schemas-microsoft-com:office:word" xmlns:w="http://schemas.openxmlformats.org/wordprocessingml/2006/main" xmlns:w14="http://schemas.microsoft.com/office/word/2010/wordml" xmlns:w15="http://schemas.microsoft.com/office/word/2012/wordml" xmlns:w16cex="http://schemas.microsoft.com/office/word/2018/wordml/cex" xmlns:w16cid="http://schemas.microsoft.com/office/word/2016/wordml/cid" xmlns:w16="http://schemas.microsoft.com/office/word/2018/wordml" xmlns:w16du="http://schemas.microsoft.com/office/word/2023/wordml/word16du" xmlns:w16sdtdh="http://schemas.microsoft.com/office/word/2020/wordml/sdtdatahash" xmlns:w16sdtfl="http://schemas.microsoft.com/office/word/2024/wordml/sdtformatlock" xmlns:w16se="http://schemas.microsoft.com/office/word/2015/wordml/symex" xmlns:wpg="http://schemas.microsoft.com/office/word/2010/wordprocessingGroup" xmlns:wpi="http://schemas.microsoft.com/office/word/2010/wordprocessingInk" xmlns:wne="http://schemas.microsoft.com/office/word/2006/wordml" xmlns:wps="http://schemas.microsoft.com/office/word/2010/wordprocessingShape" mc:Ignorable="w14 w15 w16se w16cid w16 w16cex w16sdtdh w16sdtfl w16du wp14">
   <w:abstractNum w:abstractNumId="0" w15:restartNumberingAfterBreak="0">
     <w:nsid w:val="049156A1"/>
     <w:multiLevelType w:val="hybridMultilevel"/>
@@ -6639,124 +6564,124 @@
       </w:rPr>
     </w:lvl>
   </w:abstractNum>
-  <w:num w:numId="1">
+  <w:num w:numId="1" w16cid:durableId="1167600470">
     <w:abstractNumId w:val="3"/>
   </w:num>
-  <w:num w:numId="2">
+  <w:num w:numId="2" w16cid:durableId="982738438">
     <w:abstractNumId w:val="8"/>
   </w:num>
-  <w:num w:numId="3">
+  <w:num w:numId="3" w16cid:durableId="1180778806">
     <w:abstractNumId w:val="12"/>
   </w:num>
-  <w:num w:numId="4">
+  <w:num w:numId="4" w16cid:durableId="534469153">
     <w:abstractNumId w:val="28"/>
   </w:num>
-  <w:num w:numId="5">
+  <w:num w:numId="5" w16cid:durableId="759762722">
     <w:abstractNumId w:val="30"/>
   </w:num>
-  <w:num w:numId="6">
+  <w:num w:numId="6" w16cid:durableId="447623516">
     <w:abstractNumId w:val="4"/>
   </w:num>
-  <w:num w:numId="7">
+  <w:num w:numId="7" w16cid:durableId="392896619">
     <w:abstractNumId w:val="11"/>
   </w:num>
-  <w:num w:numId="8">
+  <w:num w:numId="8" w16cid:durableId="770706381">
     <w:abstractNumId w:val="19"/>
   </w:num>
-  <w:num w:numId="9">
+  <w:num w:numId="9" w16cid:durableId="1263075923">
     <w:abstractNumId w:val="15"/>
   </w:num>
-  <w:num w:numId="10">
+  <w:num w:numId="10" w16cid:durableId="347491653">
     <w:abstractNumId w:val="9"/>
   </w:num>
-  <w:num w:numId="11">
+  <w:num w:numId="11" w16cid:durableId="1624995172">
     <w:abstractNumId w:val="24"/>
   </w:num>
-  <w:num w:numId="12">
+  <w:num w:numId="12" w16cid:durableId="1692875813">
     <w:abstractNumId w:val="35"/>
   </w:num>
-  <w:num w:numId="13">
+  <w:num w:numId="13" w16cid:durableId="1438408853">
     <w:abstractNumId w:val="29"/>
   </w:num>
-  <w:num w:numId="14">
+  <w:num w:numId="14" w16cid:durableId="906887592">
     <w:abstractNumId w:val="1"/>
   </w:num>
-  <w:num w:numId="15">
+  <w:num w:numId="15" w16cid:durableId="858733816">
     <w:abstractNumId w:val="36"/>
   </w:num>
-  <w:num w:numId="16">
+  <w:num w:numId="16" w16cid:durableId="1263950710">
     <w:abstractNumId w:val="21"/>
   </w:num>
-  <w:num w:numId="17">
+  <w:num w:numId="17" w16cid:durableId="55014991">
     <w:abstractNumId w:val="17"/>
   </w:num>
-  <w:num w:numId="18">
+  <w:num w:numId="18" w16cid:durableId="1428891810">
     <w:abstractNumId w:val="31"/>
   </w:num>
-  <w:num w:numId="19">
+  <w:num w:numId="19" w16cid:durableId="146745424">
     <w:abstractNumId w:val="10"/>
   </w:num>
-  <w:num w:numId="20">
+  <w:num w:numId="20" w16cid:durableId="2047757074">
     <w:abstractNumId w:val="39"/>
   </w:num>
-  <w:num w:numId="21">
+  <w:num w:numId="21" w16cid:durableId="1900433544">
     <w:abstractNumId w:val="34"/>
   </w:num>
-  <w:num w:numId="22">
+  <w:num w:numId="22" w16cid:durableId="82193519">
     <w:abstractNumId w:val="13"/>
   </w:num>
-  <w:num w:numId="23">
+  <w:num w:numId="23" w16cid:durableId="563762883">
     <w:abstractNumId w:val="14"/>
   </w:num>
-  <w:num w:numId="24">
+  <w:num w:numId="24" w16cid:durableId="2069722602">
     <w:abstractNumId w:val="5"/>
   </w:num>
-  <w:num w:numId="25">
+  <w:num w:numId="25" w16cid:durableId="149057689">
     <w:abstractNumId w:val="16"/>
   </w:num>
-  <w:num w:numId="26">
+  <w:num w:numId="26" w16cid:durableId="520629416">
     <w:abstractNumId w:val="20"/>
   </w:num>
-  <w:num w:numId="27">
+  <w:num w:numId="27" w16cid:durableId="495071255">
     <w:abstractNumId w:val="23"/>
   </w:num>
-  <w:num w:numId="28">
+  <w:num w:numId="28" w16cid:durableId="1668706103">
     <w:abstractNumId w:val="0"/>
   </w:num>
-  <w:num w:numId="29">
+  <w:num w:numId="29" w16cid:durableId="969018425">
     <w:abstractNumId w:val="18"/>
   </w:num>
-  <w:num w:numId="30">
+  <w:num w:numId="30" w16cid:durableId="229657775">
     <w:abstractNumId w:val="22"/>
   </w:num>
-  <w:num w:numId="31">
+  <w:num w:numId="31" w16cid:durableId="2133475854">
     <w:abstractNumId w:val="2"/>
   </w:num>
-  <w:num w:numId="32">
+  <w:num w:numId="32" w16cid:durableId="1735156064">
     <w:abstractNumId w:val="7"/>
   </w:num>
-  <w:num w:numId="33">
+  <w:num w:numId="33" w16cid:durableId="391923383">
     <w:abstractNumId w:val="32"/>
   </w:num>
-  <w:num w:numId="34">
+  <w:num w:numId="34" w16cid:durableId="623076602">
     <w:abstractNumId w:val="38"/>
   </w:num>
-  <w:num w:numId="35">
+  <w:num w:numId="35" w16cid:durableId="2048798190">
     <w:abstractNumId w:val="6"/>
   </w:num>
-  <w:num w:numId="36">
+  <w:num w:numId="36" w16cid:durableId="831945498">
     <w:abstractNumId w:val="25"/>
   </w:num>
-  <w:num w:numId="37">
+  <w:num w:numId="37" w16cid:durableId="91978428">
     <w:abstractNumId w:val="37"/>
   </w:num>
-  <w:num w:numId="38">
+  <w:num w:numId="38" w16cid:durableId="834028466">
     <w:abstractNumId w:val="27"/>
   </w:num>
-  <w:num w:numId="39">
+  <w:num w:numId="39" w16cid:durableId="1390684397">
     <w:abstractNumId w:val="26"/>
   </w:num>
-  <w:num w:numId="40">
+  <w:num w:numId="40" w16cid:durableId="283194505">
     <w:abstractNumId w:val="33"/>
   </w:num>
   <w:numIdMacAtCleanup w:val="18"/>
@@ -6764,7 +6689,7 @@
 </file>
 
 <file path=word/styles.xml><?xml version="1.0" encoding="utf-8"?>
-<w:styles xmlns:mc="http://schemas.openxmlformats.org/markup-compatibility/2006" xmlns:r="http://schemas.openxmlformats.org/officeDocument/2006/relationships" xmlns:w="http://schemas.openxmlformats.org/wordprocessingml/2006/main" xmlns:w14="http://schemas.microsoft.com/office/word/2010/wordml" xmlns:w15="http://schemas.microsoft.com/office/word/2012/wordml" xmlns:w16se="http://schemas.microsoft.com/office/word/2015/wordml/symex" mc:Ignorable="w14 w15 w16se">
+<w:styles xmlns:mc="http://schemas.openxmlformats.org/markup-compatibility/2006" xmlns:r="http://schemas.openxmlformats.org/officeDocument/2006/relationships" xmlns:w="http://schemas.openxmlformats.org/wordprocessingml/2006/main" xmlns:w14="http://schemas.microsoft.com/office/word/2010/wordml" xmlns:w15="http://schemas.microsoft.com/office/word/2012/wordml" xmlns:w16cex="http://schemas.microsoft.com/office/word/2018/wordml/cex" xmlns:w16cid="http://schemas.microsoft.com/office/word/2016/wordml/cid" xmlns:w16="http://schemas.microsoft.com/office/word/2018/wordml" xmlns:w16du="http://schemas.microsoft.com/office/word/2023/wordml/word16du" xmlns:w16sdtdh="http://schemas.microsoft.com/office/word/2020/wordml/sdtdatahash" xmlns:w16sdtfl="http://schemas.microsoft.com/office/word/2024/wordml/sdtformatlock" xmlns:w16se="http://schemas.microsoft.com/office/word/2015/wordml/symex" mc:Ignorable="w14 w15 w16se w16cid w16 w16cex w16sdtdh w16sdtfl w16du">
   <w:docDefaults>
     <w:rPrDefault>
       <w:rPr>
@@ -6780,7 +6705,7 @@
       </w:pPr>
     </w:pPrDefault>
   </w:docDefaults>
-  <w:latentStyles w:defLockedState="0" w:defUIPriority="99" w:defSemiHidden="0" w:defUnhideWhenUsed="0" w:defQFormat="0" w:count="371">
+  <w:latentStyles w:defLockedState="0" w:defUIPriority="99" w:defSemiHidden="0" w:defUnhideWhenUsed="0" w:defQFormat="0" w:count="376">
     <w:lsdException w:name="Normal" w:uiPriority="0" w:qFormat="1"/>
     <w:lsdException w:name="heading 1" w:uiPriority="9" w:qFormat="1"/>
     <w:lsdException w:name="heading 2" w:semiHidden="1" w:uiPriority="9" w:unhideWhenUsed="1" w:qFormat="1"/>
@@ -7152,6 +7077,11 @@
     <w:lsdException w:name="List Table 5 Dark Accent 6" w:uiPriority="50"/>
     <w:lsdException w:name="List Table 6 Colorful Accent 6" w:uiPriority="51"/>
     <w:lsdException w:name="List Table 7 Colorful Accent 6" w:uiPriority="52"/>
+    <w:lsdException w:name="Mention" w:semiHidden="1" w:unhideWhenUsed="1"/>
+    <w:lsdException w:name="Smart Hyperlink" w:semiHidden="1" w:unhideWhenUsed="1"/>
+    <w:lsdException w:name="Hashtag" w:semiHidden="1" w:unhideWhenUsed="1"/>
+    <w:lsdException w:name="Unresolved Mention" w:semiHidden="1" w:unhideWhenUsed="1"/>
+    <w:lsdException w:name="Smart Link" w:semiHidden="1" w:unhideWhenUsed="1"/>
   </w:latentStyles>
   <w:style w:type="paragraph" w:default="1" w:styleId="Normal">
     <w:name w:val="Normal"/>
@@ -7225,7 +7155,6 @@
   <w:style w:type="character" w:default="1" w:styleId="Fuentedeprrafopredeter">
     <w:name w:val="Default Paragraph Font"/>
     <w:uiPriority w:val="1"/>
-    <w:semiHidden/>
     <w:unhideWhenUsed/>
   </w:style>
   <w:style w:type="table" w:default="1" w:styleId="Tablanormal">
@@ -8135,7 +8064,7 @@
       <w:szCs w:val="24"/>
     </w:rPr>
   </w:style>
-  <w:style w:type="table" w:styleId="Cuadrculadetablaclara">
+  <w:style w:type="table" w:styleId="Tablaconcuadrculaclara">
     <w:name w:val="Grid Table Light"/>
     <w:basedOn w:val="Tablanormal"/>
     <w:uiPriority w:val="40"/>
@@ -8157,7 +8086,7 @@
   <w:style w:type="table" w:customStyle="1" w:styleId="Cuadrculadetablaclara1">
     <w:name w:val="Cuadrícula de tabla clara1"/>
     <w:basedOn w:val="Tablanormal"/>
-    <w:next w:val="Cuadrculadetablaclara"/>
+    <w:next w:val="Tablaconcuadrculaclara"/>
     <w:uiPriority w:val="40"/>
     <w:rsid w:val="00943DF1"/>
     <w:pPr>
@@ -8198,7 +8127,7 @@
       <w:spacing w:after="0" w:line="240" w:lineRule="auto"/>
     </w:pPr>
   </w:style>
-  <w:style w:type="character" w:styleId="Textoennegrita">
+  <w:style w:type="character" w:styleId="Fuerte">
     <w:name w:val="Strong"/>
     <w:basedOn w:val="Fuentedeprrafopredeter"/>
     <w:uiPriority w:val="22"/>
@@ -8210,532 +8139,6 @@
     </w:rPr>
   </w:style>
 </w:styles>
-</file>
-
-<file path=word/glossary/document.xml><?xml version="1.0" encoding="utf-8"?>
-<w:glossaryDocument xmlns:wpc="http://schemas.microsoft.com/office/word/2010/wordprocessingCanvas" xmlns:cx="http://schemas.microsoft.com/office/drawing/2014/chartex" xmlns:mc="http://schemas.openxmlformats.org/markup-compatibility/2006" xmlns:o="urn:schemas-microsoft-com:office:office" xmlns:r="http://schemas.openxmlformats.org/officeDocument/2006/relationships" xmlns:m="http://schemas.openxmlformats.org/officeDocument/2006/math" xmlns:v="urn:schemas-microsoft-com:vml" xmlns:wp14="http://schemas.microsoft.com/office/word/2010/wordprocessingDrawing" xmlns:wp="http://schemas.openxmlformats.org/drawingml/2006/wordprocessingDrawing" xmlns:w10="urn:schemas-microsoft-com:office:word" xmlns:w="http://schemas.openxmlformats.org/wordprocessingml/2006/main" xmlns:w14="http://schemas.microsoft.com/office/word/2010/wordml" xmlns:w15="http://schemas.microsoft.com/office/word/2012/wordml" xmlns:w16se="http://schemas.microsoft.com/office/word/2015/wordml/symex" xmlns:wpg="http://schemas.microsoft.com/office/word/2010/wordprocessingGroup" xmlns:wpi="http://schemas.microsoft.com/office/word/2010/wordprocessingInk" xmlns:wne="http://schemas.microsoft.com/office/word/2006/wordml" xmlns:wps="http://schemas.microsoft.com/office/word/2010/wordprocessingShape" mc:Ignorable="w14 w15 w16se wp14"/>
-</file>
-
-<file path=word/glossary/fontTable.xml><?xml version="1.0" encoding="utf-8"?>
-<w:fonts xmlns:mc="http://schemas.openxmlformats.org/markup-compatibility/2006" xmlns:r="http://schemas.openxmlformats.org/officeDocument/2006/relationships" xmlns:w="http://schemas.openxmlformats.org/wordprocessingml/2006/main" xmlns:w14="http://schemas.microsoft.com/office/word/2010/wordml" xmlns:w15="http://schemas.microsoft.com/office/word/2012/wordml" xmlns:w16se="http://schemas.microsoft.com/office/word/2015/wordml/symex" mc:Ignorable="w14 w15 w16se">
-  <w:font w:name="Calibri">
-    <w:panose1 w:val="020F0502020204030204"/>
-    <w:charset w:val="00"/>
-    <w:family w:val="swiss"/>
-    <w:pitch w:val="variable"/>
-    <w:sig w:usb0="E4002EFF" w:usb1="C000247B" w:usb2="00000009" w:usb3="00000000" w:csb0="000001FF" w:csb1="00000000"/>
-  </w:font>
-  <w:font w:name="Times New Roman">
-    <w:panose1 w:val="02020603050405020304"/>
-    <w:charset w:val="00"/>
-    <w:family w:val="roman"/>
-    <w:pitch w:val="variable"/>
-    <w:sig w:usb0="E0002EFF" w:usb1="C000785B" w:usb2="00000009" w:usb3="00000000" w:csb0="000001FF" w:csb1="00000000"/>
-  </w:font>
-  <w:font w:name="Courier New">
-    <w:panose1 w:val="02070309020205020404"/>
-    <w:charset w:val="00"/>
-    <w:family w:val="modern"/>
-    <w:pitch w:val="fixed"/>
-    <w:sig w:usb0="E0002EFF" w:usb1="C0007843" w:usb2="00000009" w:usb3="00000000" w:csb0="000001FF" w:csb1="00000000"/>
-  </w:font>
-  <w:font w:name="Wingdings">
-    <w:panose1 w:val="05000000000000000000"/>
-    <w:charset w:val="02"/>
-    <w:family w:val="auto"/>
-    <w:pitch w:val="variable"/>
-    <w:sig w:usb0="00000000" w:usb1="10000000" w:usb2="00000000" w:usb3="00000000" w:csb0="80000000" w:csb1="00000000"/>
-  </w:font>
-  <w:font w:name="Symbol">
-    <w:panose1 w:val="05050102010706020507"/>
-    <w:charset w:val="02"/>
-    <w:family w:val="roman"/>
-    <w:pitch w:val="variable"/>
-    <w:sig w:usb0="00000000" w:usb1="10000000" w:usb2="00000000" w:usb3="00000000" w:csb0="80000000" w:csb1="00000000"/>
-  </w:font>
-  <w:font w:name="Calibri Light">
-    <w:panose1 w:val="020F0302020204030204"/>
-    <w:charset w:val="00"/>
-    <w:family w:val="swiss"/>
-    <w:pitch w:val="variable"/>
-    <w:sig w:usb0="E4002EFF" w:usb1="C000247B" w:usb2="00000009" w:usb3="00000000" w:csb0="000001FF" w:csb1="00000000"/>
-  </w:font>
-  <w:font w:name="Segoe UI">
-    <w:panose1 w:val="020B0502040204020203"/>
-    <w:charset w:val="00"/>
-    <w:family w:val="swiss"/>
-    <w:pitch w:val="variable"/>
-    <w:sig w:usb0="E4002EFF" w:usb1="C000E47F" w:usb2="00000009" w:usb3="00000000" w:csb0="000001FF" w:csb1="00000000"/>
-  </w:font>
-  <w:font w:name="Century Gothic">
-    <w:panose1 w:val="020B0502020202020204"/>
-    <w:charset w:val="00"/>
-    <w:family w:val="swiss"/>
-    <w:pitch w:val="variable"/>
-    <w:sig w:usb0="00000287" w:usb1="00000000" w:usb2="00000000" w:usb3="00000000" w:csb0="0000009F" w:csb1="00000000"/>
-  </w:font>
-</w:fonts>
-</file>
-
-<file path=word/glossary/settings.xml><?xml version="1.0" encoding="utf-8"?>
-<w:settings xmlns:mc="http://schemas.openxmlformats.org/markup-compatibility/2006" xmlns:o="urn:schemas-microsoft-com:office:office" xmlns:r="http://schemas.openxmlformats.org/officeDocument/2006/relationships" xmlns:m="http://schemas.openxmlformats.org/officeDocument/2006/math" xmlns:v="urn:schemas-microsoft-com:vml" xmlns:w10="urn:schemas-microsoft-com:office:word" xmlns:w="http://schemas.openxmlformats.org/wordprocessingml/2006/main" xmlns:w14="http://schemas.microsoft.com/office/word/2010/wordml" xmlns:w15="http://schemas.microsoft.com/office/word/2012/wordml" xmlns:w16se="http://schemas.microsoft.com/office/word/2015/wordml/symex" xmlns:sl="http://schemas.openxmlformats.org/schemaLibrary/2006/main" mc:Ignorable="w14 w15 w16se">
-  <w:defaultTabStop w:val="708"/>
-  <w:hyphenationZone w:val="425"/>
-  <w:characterSpacingControl w:val="doNotCompress"/>
-  <w:compat>
-    <w:useFELayout/>
-    <w:compatSetting w:name="compatibilityMode" w:uri="http://schemas.microsoft.com/office/word" w:val="12"/>
-  </w:compat>
-  <w:rsids>
-    <w:rsidRoot w:val="008F14D6"/>
-    <w:rsid w:val="008F14D6"/>
-  </w:rsids>
-  <m:mathPr>
-    <m:mathFont m:val="Cambria Math"/>
-    <m:brkBin m:val="before"/>
-    <m:brkBinSub m:val="--"/>
-    <m:smallFrac m:val="0"/>
-    <m:dispDef/>
-    <m:lMargin m:val="0"/>
-    <m:rMargin m:val="0"/>
-    <m:defJc m:val="centerGroup"/>
-    <m:wrapIndent m:val="1440"/>
-    <m:intLim m:val="subSup"/>
-    <m:naryLim m:val="undOvr"/>
-  </m:mathPr>
-  <w:themeFontLang w:val="es-CL"/>
-  <w:clrSchemeMapping w:bg1="light1" w:t1="dark1" w:bg2="light2" w:t2="dark2" w:accent1="accent1" w:accent2="accent2" w:accent3="accent3" w:accent4="accent4" w:accent5="accent5" w:accent6="accent6" w:hyperlink="hyperlink" w:followedHyperlink="followedHyperlink"/>
-  <w:decimalSymbol w:val=","/>
-  <w:listSeparator w:val=";"/>
-</w:settings>
-</file>
-
-<file path=word/glossary/styles.xml><?xml version="1.0" encoding="utf-8"?>
-<w:styles xmlns:mc="http://schemas.openxmlformats.org/markup-compatibility/2006" xmlns:r="http://schemas.openxmlformats.org/officeDocument/2006/relationships" xmlns:w="http://schemas.openxmlformats.org/wordprocessingml/2006/main" xmlns:w14="http://schemas.microsoft.com/office/word/2010/wordml" xmlns:w15="http://schemas.microsoft.com/office/word/2012/wordml" xmlns:w16se="http://schemas.microsoft.com/office/word/2015/wordml/symex" mc:Ignorable="w14 w15 w16se">
-  <w:docDefaults>
-    <w:rPrDefault>
-      <w:rPr>
-        <w:rFonts w:asciiTheme="minorHAnsi" w:eastAsiaTheme="minorEastAsia" w:hAnsiTheme="minorHAnsi" w:cstheme="minorBidi"/>
-        <w:sz w:val="22"/>
-        <w:szCs w:val="22"/>
-        <w:lang w:val="es-CL" w:eastAsia="es-CL" w:bidi="ar-SA"/>
-      </w:rPr>
-    </w:rPrDefault>
-    <w:pPrDefault>
-      <w:pPr>
-        <w:spacing w:after="160" w:line="259" w:lineRule="auto"/>
-      </w:pPr>
-    </w:pPrDefault>
-  </w:docDefaults>
-  <w:latentStyles w:defLockedState="0" w:defUIPriority="99" w:defSemiHidden="0" w:defUnhideWhenUsed="0" w:defQFormat="0" w:count="371">
-    <w:lsdException w:name="Normal" w:uiPriority="0" w:qFormat="1"/>
-    <w:lsdException w:name="heading 1" w:uiPriority="9" w:qFormat="1"/>
-    <w:lsdException w:name="heading 2" w:semiHidden="1" w:uiPriority="9" w:unhideWhenUsed="1" w:qFormat="1"/>
-    <w:lsdException w:name="heading 3" w:semiHidden="1" w:uiPriority="9" w:unhideWhenUsed="1" w:qFormat="1"/>
-    <w:lsdException w:name="heading 4" w:semiHidden="1" w:uiPriority="9" w:unhideWhenUsed="1" w:qFormat="1"/>
-    <w:lsdException w:name="heading 5" w:semiHidden="1" w:uiPriority="9" w:unhideWhenUsed="1" w:qFormat="1"/>
-    <w:lsdException w:name="heading 6" w:semiHidden="1" w:uiPriority="9" w:unhideWhenUsed="1" w:qFormat="1"/>
-    <w:lsdException w:name="heading 7" w:semiHidden="1" w:uiPriority="9" w:unhideWhenUsed="1" w:qFormat="1"/>
-    <w:lsdException w:name="heading 8" w:semiHidden="1" w:uiPriority="9" w:unhideWhenUsed="1" w:qFormat="1"/>
-    <w:lsdException w:name="heading 9" w:semiHidden="1" w:uiPriority="9" w:unhideWhenUsed="1" w:qFormat="1"/>
-    <w:lsdException w:name="index 1" w:semiHidden="1" w:unhideWhenUsed="1"/>
-    <w:lsdException w:name="index 2" w:semiHidden="1" w:unhideWhenUsed="1"/>
-    <w:lsdException w:name="index 3" w:semiHidden="1" w:unhideWhenUsed="1"/>
-    <w:lsdException w:name="index 4" w:semiHidden="1" w:unhideWhenUsed="1"/>
-    <w:lsdException w:name="index 5" w:semiHidden="1" w:unhideWhenUsed="1"/>
-    <w:lsdException w:name="index 6" w:semiHidden="1" w:unhideWhenUsed="1"/>
-    <w:lsdException w:name="index 7" w:semiHidden="1" w:unhideWhenUsed="1"/>
-    <w:lsdException w:name="index 8" w:semiHidden="1" w:unhideWhenUsed="1"/>
-    <w:lsdException w:name="index 9" w:semiHidden="1" w:unhideWhenUsed="1"/>
-    <w:lsdException w:name="toc 1" w:semiHidden="1" w:uiPriority="39" w:unhideWhenUsed="1"/>
-    <w:lsdException w:name="toc 2" w:semiHidden="1" w:uiPriority="39" w:unhideWhenUsed="1"/>
-    <w:lsdException w:name="toc 3" w:semiHidden="1" w:uiPriority="39" w:unhideWhenUsed="1"/>
-    <w:lsdException w:name="toc 4" w:semiHidden="1" w:uiPriority="39" w:unhideWhenUsed="1"/>
-    <w:lsdException w:name="toc 5" w:semiHidden="1" w:uiPriority="39" w:unhideWhenUsed="1"/>
-    <w:lsdException w:name="toc 6" w:semiHidden="1" w:uiPriority="39" w:unhideWhenUsed="1"/>
-    <w:lsdException w:name="toc 7" w:semiHidden="1" w:uiPriority="39" w:unhideWhenUsed="1"/>
-    <w:lsdException w:name="toc 8" w:semiHidden="1" w:uiPriority="39" w:unhideWhenUsed="1"/>
-    <w:lsdException w:name="toc 9" w:semiHidden="1" w:uiPriority="39" w:unhideWhenUsed="1"/>
-    <w:lsdException w:name="Normal Indent" w:semiHidden="1" w:unhideWhenUsed="1"/>
-    <w:lsdException w:name="footnote text" w:semiHidden="1" w:unhideWhenUsed="1"/>
-    <w:lsdException w:name="annotation text" w:semiHidden="1" w:unhideWhenUsed="1"/>
-    <w:lsdException w:name="header" w:semiHidden="1" w:unhideWhenUsed="1"/>
-    <w:lsdException w:name="footer" w:semiHidden="1" w:unhideWhenUsed="1"/>
-    <w:lsdException w:name="index heading" w:semiHidden="1" w:unhideWhenUsed="1"/>
-    <w:lsdException w:name="caption" w:semiHidden="1" w:uiPriority="35" w:unhideWhenUsed="1" w:qFormat="1"/>
-    <w:lsdException w:name="table of figures" w:semiHidden="1" w:unhideWhenUsed="1"/>
-    <w:lsdException w:name="envelope address" w:semiHidden="1" w:unhideWhenUsed="1"/>
-    <w:lsdException w:name="envelope return" w:semiHidden="1" w:unhideWhenUsed="1"/>
-    <w:lsdException w:name="footnote reference" w:semiHidden="1" w:unhideWhenUsed="1"/>
-    <w:lsdException w:name="annotation reference" w:semiHidden="1" w:unhideWhenUsed="1"/>
-    <w:lsdException w:name="line number" w:semiHidden="1" w:unhideWhenUsed="1"/>
-    <w:lsdException w:name="page number" w:semiHidden="1" w:unhideWhenUsed="1"/>
-    <w:lsdException w:name="endnote reference" w:semiHidden="1" w:unhideWhenUsed="1"/>
-    <w:lsdException w:name="endnote text" w:semiHidden="1" w:unhideWhenUsed="1"/>
-    <w:lsdException w:name="table of authorities" w:semiHidden="1" w:unhideWhenUsed="1"/>
-    <w:lsdException w:name="macro" w:semiHidden="1" w:unhideWhenUsed="1"/>
-    <w:lsdException w:name="toa heading" w:semiHidden="1" w:unhideWhenUsed="1"/>
-    <w:lsdException w:name="List" w:semiHidden="1" w:unhideWhenUsed="1"/>
-    <w:lsdException w:name="List Bullet" w:semiHidden="1" w:unhideWhenUsed="1"/>
-    <w:lsdException w:name="List Number" w:semiHidden="1" w:unhideWhenUsed="1"/>
-    <w:lsdException w:name="List 2" w:semiHidden="1" w:unhideWhenUsed="1"/>
-    <w:lsdException w:name="List 3" w:semiHidden="1" w:unhideWhenUsed="1"/>
-    <w:lsdException w:name="List 4" w:semiHidden="1" w:unhideWhenUsed="1"/>
-    <w:lsdException w:name="List 5" w:semiHidden="1" w:unhideWhenUsed="1"/>
-    <w:lsdException w:name="List Bullet 2" w:semiHidden="1" w:unhideWhenUsed="1"/>
-    <w:lsdException w:name="List Bullet 3" w:semiHidden="1" w:unhideWhenUsed="1"/>
-    <w:lsdException w:name="List Bullet 4" w:semiHidden="1" w:unhideWhenUsed="1"/>
-    <w:lsdException w:name="List Bullet 5" w:semiHidden="1" w:unhideWhenUsed="1"/>
-    <w:lsdException w:name="List Number 2" w:semiHidden="1" w:unhideWhenUsed="1"/>
-    <w:lsdException w:name="List Number 3" w:semiHidden="1" w:unhideWhenUsed="1"/>
-    <w:lsdException w:name="List Number 4" w:semiHidden="1" w:unhideWhenUsed="1"/>
-    <w:lsdException w:name="List Number 5" w:semiHidden="1" w:unhideWhenUsed="1"/>
-    <w:lsdException w:name="Title" w:uiPriority="10" w:qFormat="1"/>
-    <w:lsdException w:name="Closing" w:semiHidden="1" w:unhideWhenUsed="1"/>
-    <w:lsdException w:name="Signature" w:semiHidden="1" w:unhideWhenUsed="1"/>
-    <w:lsdException w:name="Default Paragraph Font" w:semiHidden="1" w:uiPriority="1" w:unhideWhenUsed="1"/>
-    <w:lsdException w:name="Body Text" w:semiHidden="1" w:unhideWhenUsed="1"/>
-    <w:lsdException w:name="Body Text Indent" w:semiHidden="1" w:unhideWhenUsed="1"/>
-    <w:lsdException w:name="List Continue" w:semiHidden="1" w:unhideWhenUsed="1"/>
-    <w:lsdException w:name="List Continue 2" w:semiHidden="1" w:unhideWhenUsed="1"/>
-    <w:lsdException w:name="List Continue 3" w:semiHidden="1" w:unhideWhenUsed="1"/>
-    <w:lsdException w:name="List Continue 4" w:semiHidden="1" w:unhideWhenUsed="1"/>
-    <w:lsdException w:name="List Continue 5" w:semiHidden="1" w:unhideWhenUsed="1"/>
-    <w:lsdException w:name="Message Header" w:semiHidden="1" w:unhideWhenUsed="1"/>
-    <w:lsdException w:name="Subtitle" w:uiPriority="11" w:qFormat="1"/>
-    <w:lsdException w:name="Salutation" w:semiHidden="1" w:unhideWhenUsed="1"/>
-    <w:lsdException w:name="Date" w:semiHidden="1" w:unhideWhenUsed="1"/>
-    <w:lsdException w:name="Body Text First Indent" w:semiHidden="1" w:unhideWhenUsed="1"/>
-    <w:lsdException w:name="Body Text First Indent 2" w:semiHidden="1" w:unhideWhenUsed="1"/>
-    <w:lsdException w:name="Note Heading" w:semiHidden="1" w:unhideWhenUsed="1"/>
-    <w:lsdException w:name="Body Text 2" w:semiHidden="1" w:unhideWhenUsed="1"/>
-    <w:lsdException w:name="Body Text 3" w:semiHidden="1" w:unhideWhenUsed="1"/>
-    <w:lsdException w:name="Body Text Indent 2" w:semiHidden="1" w:unhideWhenUsed="1"/>
-    <w:lsdException w:name="Body Text Indent 3" w:semiHidden="1" w:unhideWhenUsed="1"/>
-    <w:lsdException w:name="Block Text" w:semiHidden="1" w:unhideWhenUsed="1"/>
-    <w:lsdException w:name="Hyperlink" w:semiHidden="1" w:unhideWhenUsed="1"/>
-    <w:lsdException w:name="FollowedHyperlink" w:semiHidden="1" w:unhideWhenUsed="1"/>
-    <w:lsdException w:name="Strong" w:uiPriority="22" w:qFormat="1"/>
-    <w:lsdException w:name="Emphasis" w:uiPriority="20" w:qFormat="1"/>
-    <w:lsdException w:name="Document Map" w:semiHidden="1" w:unhideWhenUsed="1"/>
-    <w:lsdException w:name="Plain Text" w:semiHidden="1" w:unhideWhenUsed="1"/>
-    <w:lsdException w:name="E-mail Signature" w:semiHidden="1" w:unhideWhenUsed="1"/>
-    <w:lsdException w:name="HTML Top of Form" w:semiHidden="1" w:unhideWhenUsed="1"/>
-    <w:lsdException w:name="HTML Bottom of Form" w:semiHidden="1" w:unhideWhenUsed="1"/>
-    <w:lsdException w:name="Normal (Web)" w:semiHidden="1" w:unhideWhenUsed="1"/>
-    <w:lsdException w:name="HTML Acronym" w:semiHidden="1" w:unhideWhenUsed="1"/>
-    <w:lsdException w:name="HTML Address" w:semiHidden="1" w:unhideWhenUsed="1"/>
-    <w:lsdException w:name="HTML Cite" w:semiHidden="1" w:unhideWhenUsed="1"/>
-    <w:lsdException w:name="HTML Code" w:semiHidden="1" w:unhideWhenUsed="1"/>
-    <w:lsdException w:name="HTML Definition" w:semiHidden="1" w:unhideWhenUsed="1"/>
-    <w:lsdException w:name="HTML Keyboard" w:semiHidden="1" w:unhideWhenUsed="1"/>
-    <w:lsdException w:name="HTML Preformatted" w:semiHidden="1" w:unhideWhenUsed="1"/>
-    <w:lsdException w:name="HTML Sample" w:semiHidden="1" w:unhideWhenUsed="1"/>
-    <w:lsdException w:name="HTML Typewriter" w:semiHidden="1" w:unhideWhenUsed="1"/>
-    <w:lsdException w:name="HTML Variable" w:semiHidden="1" w:unhideWhenUsed="1"/>
-    <w:lsdException w:name="Normal Table" w:semiHidden="1" w:unhideWhenUsed="1"/>
-    <w:lsdException w:name="annotation subject" w:semiHidden="1" w:unhideWhenUsed="1"/>
-    <w:lsdException w:name="No List" w:semiHidden="1" w:unhideWhenUsed="1"/>
-    <w:lsdException w:name="Outline List 1" w:semiHidden="1" w:unhideWhenUsed="1"/>
-    <w:lsdException w:name="Outline List 2" w:semiHidden="1" w:unhideWhenUsed="1"/>
-    <w:lsdException w:name="Outline List 3" w:semiHidden="1" w:unhideWhenUsed="1"/>
-    <w:lsdException w:name="Table Simple 1" w:semiHidden="1" w:unhideWhenUsed="1"/>
-    <w:lsdException w:name="Table Simple 2" w:semiHidden="1" w:unhideWhenUsed="1"/>
-    <w:lsdException w:name="Table Simple 3" w:semiHidden="1" w:unhideWhenUsed="1"/>
-    <w:lsdException w:name="Table Classic 1" w:semiHidden="1" w:unhideWhenUsed="1"/>
-    <w:lsdException w:name="Table Classic 2" w:semiHidden="1" w:unhideWhenUsed="1"/>
-    <w:lsdException w:name="Table Classic 3" w:semiHidden="1" w:unhideWhenUsed="1"/>
-    <w:lsdException w:name="Table Classic 4" w:semiHidden="1" w:unhideWhenUsed="1"/>
-    <w:lsdException w:name="Table Colorful 1" w:semiHidden="1" w:unhideWhenUsed="1"/>
-    <w:lsdException w:name="Table Colorful 2" w:semiHidden="1" w:unhideWhenUsed="1"/>
-    <w:lsdException w:name="Table Colorful 3" w:semiHidden="1" w:unhideWhenUsed="1"/>
-    <w:lsdException w:name="Table Columns 1" w:semiHidden="1" w:unhideWhenUsed="1"/>
-    <w:lsdException w:name="Table Columns 2" w:semiHidden="1" w:unhideWhenUsed="1"/>
-    <w:lsdException w:name="Table Columns 3" w:semiHidden="1" w:unhideWhenUsed="1"/>
-    <w:lsdException w:name="Table Columns 4" w:semiHidden="1" w:unhideWhenUsed="1"/>
-    <w:lsdException w:name="Table Columns 5" w:semiHidden="1" w:unhideWhenUsed="1"/>
-    <w:lsdException w:name="Table Grid 1" w:semiHidden="1" w:unhideWhenUsed="1"/>
-    <w:lsdException w:name="Table Grid 2" w:semiHidden="1" w:unhideWhenUsed="1"/>
-    <w:lsdException w:name="Table Grid 3" w:semiHidden="1" w:unhideWhenUsed="1"/>
-    <w:lsdException w:name="Table Grid 4" w:semiHidden="1" w:unhideWhenUsed="1"/>
-    <w:lsdException w:name="Table Grid 5" w:semiHidden="1" w:unhideWhenUsed="1"/>
-    <w:lsdException w:name="Table Grid 6" w:semiHidden="1" w:unhideWhenUsed="1"/>
-    <w:lsdException w:name="Table Grid 7" w:semiHidden="1" w:unhideWhenUsed="1"/>
-    <w:lsdException w:name="Table Grid 8" w:semiHidden="1" w:unhideWhenUsed="1"/>
-    <w:lsdException w:name="Table List 1" w:semiHidden="1" w:unhideWhenUsed="1"/>
-    <w:lsdException w:name="Table List 2" w:semiHidden="1" w:unhideWhenUsed="1"/>
-    <w:lsdException w:name="Table List 3" w:semiHidden="1" w:unhideWhenUsed="1"/>
-    <w:lsdException w:name="Table List 4" w:semiHidden="1" w:unhideWhenUsed="1"/>
-    <w:lsdException w:name="Table List 5" w:semiHidden="1" w:unhideWhenUsed="1"/>
-    <w:lsdException w:name="Table List 6" w:semiHidden="1" w:unhideWhenUsed="1"/>
-    <w:lsdException w:name="Table List 7" w:semiHidden="1" w:unhideWhenUsed="1"/>
-    <w:lsdException w:name="Table List 8" w:semiHidden="1" w:unhideWhenUsed="1"/>
-    <w:lsdException w:name="Table 3D effects 1" w:semiHidden="1" w:unhideWhenUsed="1"/>
-    <w:lsdException w:name="Table 3D effects 2" w:semiHidden="1" w:unhideWhenUsed="1"/>
-    <w:lsdException w:name="Table 3D effects 3" w:semiHidden="1" w:unhideWhenUsed="1"/>
-    <w:lsdException w:name="Table Contemporary" w:semiHidden="1" w:unhideWhenUsed="1"/>
-    <w:lsdException w:name="Table Elegant" w:semiHidden="1" w:unhideWhenUsed="1"/>
-    <w:lsdException w:name="Table Professional" w:semiHidden="1" w:unhideWhenUsed="1"/>
-    <w:lsdException w:name="Table Subtle 1" w:semiHidden="1" w:unhideWhenUsed="1"/>
-    <w:lsdException w:name="Table Subtle 2" w:semiHidden="1" w:unhideWhenUsed="1"/>
-    <w:lsdException w:name="Table Web 1" w:semiHidden="1" w:unhideWhenUsed="1"/>
-    <w:lsdException w:name="Table Web 2" w:semiHidden="1" w:unhideWhenUsed="1"/>
-    <w:lsdException w:name="Table Web 3" w:semiHidden="1" w:unhideWhenUsed="1"/>
-    <w:lsdException w:name="Balloon Text" w:semiHidden="1" w:unhideWhenUsed="1"/>
-    <w:lsdException w:name="Table Grid" w:uiPriority="39"/>
-    <w:lsdException w:name="Table Theme" w:semiHidden="1" w:unhideWhenUsed="1"/>
-    <w:lsdException w:name="Placeholder Text" w:semiHidden="1"/>
-    <w:lsdException w:name="No Spacing" w:uiPriority="1" w:qFormat="1"/>
-    <w:lsdException w:name="Light Shading" w:uiPriority="60"/>
-    <w:lsdException w:name="Light List" w:uiPriority="61"/>
-    <w:lsdException w:name="Light Grid" w:uiPriority="62"/>
-    <w:lsdException w:name="Medium Shading 1" w:uiPriority="63"/>
-    <w:lsdException w:name="Medium Shading 2" w:uiPriority="64"/>
-    <w:lsdException w:name="Medium List 1" w:uiPriority="65"/>
-    <w:lsdException w:name="Medium List 2" w:uiPriority="66"/>
-    <w:lsdException w:name="Medium Grid 1" w:uiPriority="67"/>
-    <w:lsdException w:name="Medium Grid 2" w:uiPriority="68"/>
-    <w:lsdException w:name="Medium Grid 3" w:uiPriority="69"/>
-    <w:lsdException w:name="Dark List" w:uiPriority="70"/>
-    <w:lsdException w:name="Colorful Shading" w:uiPriority="71"/>
-    <w:lsdException w:name="Colorful List" w:uiPriority="72"/>
-    <w:lsdException w:name="Colorful Grid" w:uiPriority="73"/>
-    <w:lsdException w:name="Light Shading Accent 1" w:uiPriority="60"/>
-    <w:lsdException w:name="Light List Accent 1" w:uiPriority="61"/>
-    <w:lsdException w:name="Light Grid Accent 1" w:uiPriority="62"/>
-    <w:lsdException w:name="Medium Shading 1 Accent 1" w:uiPriority="63"/>
-    <w:lsdException w:name="Medium Shading 2 Accent 1" w:uiPriority="64"/>
-    <w:lsdException w:name="Medium List 1 Accent 1" w:uiPriority="65"/>
-    <w:lsdException w:name="Revision" w:semiHidden="1"/>
-    <w:lsdException w:name="List Paragraph" w:uiPriority="34" w:qFormat="1"/>
-    <w:lsdException w:name="Quote" w:uiPriority="29" w:qFormat="1"/>
-    <w:lsdException w:name="Intense Quote" w:uiPriority="30" w:qFormat="1"/>
-    <w:lsdException w:name="Medium List 2 Accent 1" w:uiPriority="66"/>
-    <w:lsdException w:name="Medium Grid 1 Accent 1" w:uiPriority="67"/>
-    <w:lsdException w:name="Medium Grid 2 Accent 1" w:uiPriority="68"/>
-    <w:lsdException w:name="Medium Grid 3 Accent 1" w:uiPriority="69"/>
-    <w:lsdException w:name="Dark List Accent 1" w:uiPriority="70"/>
-    <w:lsdException w:name="Colorful Shading Accent 1" w:uiPriority="71"/>
-    <w:lsdException w:name="Colorful List Accent 1" w:uiPriority="72"/>
-    <w:lsdException w:name="Colorful Grid Accent 1" w:uiPriority="73"/>
-    <w:lsdException w:name="Light Shading Accent 2" w:uiPriority="60"/>
-    <w:lsdException w:name="Light List Accent 2" w:uiPriority="61"/>
-    <w:lsdException w:name="Light Grid Accent 2" w:uiPriority="62"/>
-    <w:lsdException w:name="Medium Shading 1 Accent 2" w:uiPriority="63"/>
-    <w:lsdException w:name="Medium Shading 2 Accent 2" w:uiPriority="64"/>
-    <w:lsdException w:name="Medium List 1 Accent 2" w:uiPriority="65"/>
-    <w:lsdException w:name="Medium List 2 Accent 2" w:uiPriority="66"/>
-    <w:lsdException w:name="Medium Grid 1 Accent 2" w:uiPriority="67"/>
-    <w:lsdException w:name="Medium Grid 2 Accent 2" w:uiPriority="68"/>
-    <w:lsdException w:name="Medium Grid 3 Accent 2" w:uiPriority="69"/>
-    <w:lsdException w:name="Dark List Accent 2" w:uiPriority="70"/>
-    <w:lsdException w:name="Colorful Shading Accent 2" w:uiPriority="71"/>
-    <w:lsdException w:name="Colorful List Accent 2" w:uiPriority="72"/>
-    <w:lsdException w:name="Colorful Grid Accent 2" w:uiPriority="73"/>
-    <w:lsdException w:name="Light Shading Accent 3" w:uiPriority="60"/>
-    <w:lsdException w:name="Light List Accent 3" w:uiPriority="61"/>
-    <w:lsdException w:name="Light Grid Accent 3" w:uiPriority="62"/>
-    <w:lsdException w:name="Medium Shading 1 Accent 3" w:uiPriority="63"/>
-    <w:lsdException w:name="Medium Shading 2 Accent 3" w:uiPriority="64"/>
-    <w:lsdException w:name="Medium List 1 Accent 3" w:uiPriority="65"/>
-    <w:lsdException w:name="Medium List 2 Accent 3" w:uiPriority="66"/>
-    <w:lsdException w:name="Medium Grid 1 Accent 3" w:uiPriority="67"/>
-    <w:lsdException w:name="Medium Grid 2 Accent 3" w:uiPriority="68"/>
-    <w:lsdException w:name="Medium Grid 3 Accent 3" w:uiPriority="69"/>
-    <w:lsdException w:name="Dark List Accent 3" w:uiPriority="70"/>
-    <w:lsdException w:name="Colorful Shading Accent 3" w:uiPriority="71"/>
-    <w:lsdException w:name="Colorful List Accent 3" w:uiPriority="72"/>
-    <w:lsdException w:name="Colorful Grid Accent 3" w:uiPriority="73"/>
-    <w:lsdException w:name="Light Shading Accent 4" w:uiPriority="60"/>
-    <w:lsdException w:name="Light List Accent 4" w:uiPriority="61"/>
-    <w:lsdException w:name="Light Grid Accent 4" w:uiPriority="62"/>
-    <w:lsdException w:name="Medium Shading 1 Accent 4" w:uiPriority="63"/>
-    <w:lsdException w:name="Medium Shading 2 Accent 4" w:uiPriority="64"/>
-    <w:lsdException w:name="Medium List 1 Accent 4" w:uiPriority="65"/>
-    <w:lsdException w:name="Medium List 2 Accent 4" w:uiPriority="66"/>
-    <w:lsdException w:name="Medium Grid 1 Accent 4" w:uiPriority="67"/>
-    <w:lsdException w:name="Medium Grid 2 Accent 4" w:uiPriority="68"/>
-    <w:lsdException w:name="Medium Grid 3 Accent 4" w:uiPriority="69"/>
-    <w:lsdException w:name="Dark List Accent 4" w:uiPriority="70"/>
-    <w:lsdException w:name="Colorful Shading Accent 4" w:uiPriority="71"/>
-    <w:lsdException w:name="Colorful List Accent 4" w:uiPriority="72"/>
-    <w:lsdException w:name="Colorful Grid Accent 4" w:uiPriority="73"/>
-    <w:lsdException w:name="Light Shading Accent 5" w:uiPriority="60"/>
-    <w:lsdException w:name="Light List Accent 5" w:uiPriority="61"/>
-    <w:lsdException w:name="Light Grid Accent 5" w:uiPriority="62"/>
-    <w:lsdException w:name="Medium Shading 1 Accent 5" w:uiPriority="63"/>
-    <w:lsdException w:name="Medium Shading 2 Accent 5" w:uiPriority="64"/>
-    <w:lsdException w:name="Medium List 1 Accent 5" w:uiPriority="65"/>
-    <w:lsdException w:name="Medium List 2 Accent 5" w:uiPriority="66"/>
-    <w:lsdException w:name="Medium Grid 1 Accent 5" w:uiPriority="67"/>
-    <w:lsdException w:name="Medium Grid 2 Accent 5" w:uiPriority="68"/>
-    <w:lsdException w:name="Medium Grid 3 Accent 5" w:uiPriority="69"/>
-    <w:lsdException w:name="Dark List Accent 5" w:uiPriority="70"/>
-    <w:lsdException w:name="Colorful Shading Accent 5" w:uiPriority="71"/>
-    <w:lsdException w:name="Colorful List Accent 5" w:uiPriority="72"/>
-    <w:lsdException w:name="Colorful Grid Accent 5" w:uiPriority="73"/>
-    <w:lsdException w:name="Light Shading Accent 6" w:uiPriority="60"/>
-    <w:lsdException w:name="Light List Accent 6" w:uiPriority="61"/>
-    <w:lsdException w:name="Light Grid Accent 6" w:uiPriority="62"/>
-    <w:lsdException w:name="Medium Shading 1 Accent 6" w:uiPriority="63"/>
-    <w:lsdException w:name="Medium Shading 2 Accent 6" w:uiPriority="64"/>
-    <w:lsdException w:name="Medium List 1 Accent 6" w:uiPriority="65"/>
-    <w:lsdException w:name="Medium List 2 Accent 6" w:uiPriority="66"/>
-    <w:lsdException w:name="Medium Grid 1 Accent 6" w:uiPriority="67"/>
-    <w:lsdException w:name="Medium Grid 2 Accent 6" w:uiPriority="68"/>
-    <w:lsdException w:name="Medium Grid 3 Accent 6" w:uiPriority="69"/>
-    <w:lsdException w:name="Dark List Accent 6" w:uiPriority="70"/>
-    <w:lsdException w:name="Colorful Shading Accent 6" w:uiPriority="71"/>
-    <w:lsdException w:name="Colorful List Accent 6" w:uiPriority="72"/>
-    <w:lsdException w:name="Colorful Grid Accent 6" w:uiPriority="73"/>
-    <w:lsdException w:name="Subtle Emphasis" w:uiPriority="19" w:qFormat="1"/>
-    <w:lsdException w:name="Intense Emphasis" w:uiPriority="21" w:qFormat="1"/>
-    <w:lsdException w:name="Subtle Reference" w:uiPriority="31" w:qFormat="1"/>
-    <w:lsdException w:name="Intense Reference" w:uiPriority="32" w:qFormat="1"/>
-    <w:lsdException w:name="Book Title" w:uiPriority="33" w:qFormat="1"/>
-    <w:lsdException w:name="Bibliography" w:semiHidden="1" w:uiPriority="37" w:unhideWhenUsed="1"/>
-    <w:lsdException w:name="TOC Heading" w:semiHidden="1" w:uiPriority="39" w:unhideWhenUsed="1" w:qFormat="1"/>
-    <w:lsdException w:name="Plain Table 1" w:uiPriority="41"/>
-    <w:lsdException w:name="Plain Table 2" w:uiPriority="42"/>
-    <w:lsdException w:name="Plain Table 3" w:uiPriority="43"/>
-    <w:lsdException w:name="Plain Table 4" w:uiPriority="44"/>
-    <w:lsdException w:name="Plain Table 5" w:uiPriority="45"/>
-    <w:lsdException w:name="Grid Table Light" w:uiPriority="40"/>
-    <w:lsdException w:name="Grid Table 1 Light" w:uiPriority="46"/>
-    <w:lsdException w:name="Grid Table 2" w:uiPriority="47"/>
-    <w:lsdException w:name="Grid Table 3" w:uiPriority="48"/>
-    <w:lsdException w:name="Grid Table 4" w:uiPriority="49"/>
-    <w:lsdException w:name="Grid Table 5 Dark" w:uiPriority="50"/>
-    <w:lsdException w:name="Grid Table 6 Colorful" w:uiPriority="51"/>
-    <w:lsdException w:name="Grid Table 7 Colorful" w:uiPriority="52"/>
-    <w:lsdException w:name="Grid Table 1 Light Accent 1" w:uiPriority="46"/>
-    <w:lsdException w:name="Grid Table 2 Accent 1" w:uiPriority="47"/>
-    <w:lsdException w:name="Grid Table 3 Accent 1" w:uiPriority="48"/>
-    <w:lsdException w:name="Grid Table 4 Accent 1" w:uiPriority="49"/>
-    <w:lsdException w:name="Grid Table 5 Dark Accent 1" w:uiPriority="50"/>
-    <w:lsdException w:name="Grid Table 6 Colorful Accent 1" w:uiPriority="51"/>
-    <w:lsdException w:name="Grid Table 7 Colorful Accent 1" w:uiPriority="52"/>
-    <w:lsdException w:name="Grid Table 1 Light Accent 2" w:uiPriority="46"/>
-    <w:lsdException w:name="Grid Table 2 Accent 2" w:uiPriority="47"/>
-    <w:lsdException w:name="Grid Table 3 Accent 2" w:uiPriority="48"/>
-    <w:lsdException w:name="Grid Table 4 Accent 2" w:uiPriority="49"/>
-    <w:lsdException w:name="Grid Table 5 Dark Accent 2" w:uiPriority="50"/>
-    <w:lsdException w:name="Grid Table 6 Colorful Accent 2" w:uiPriority="51"/>
-    <w:lsdException w:name="Grid Table 7 Colorful Accent 2" w:uiPriority="52"/>
-    <w:lsdException w:name="Grid Table 1 Light Accent 3" w:uiPriority="46"/>
-    <w:lsdException w:name="Grid Table 2 Accent 3" w:uiPriority="47"/>
-    <w:lsdException w:name="Grid Table 3 Accent 3" w:uiPriority="48"/>
-    <w:lsdException w:name="Grid Table 4 Accent 3" w:uiPriority="49"/>
-    <w:lsdException w:name="Grid Table 5 Dark Accent 3" w:uiPriority="50"/>
-    <w:lsdException w:name="Grid Table 6 Colorful Accent 3" w:uiPriority="51"/>
-    <w:lsdException w:name="Grid Table 7 Colorful Accent 3" w:uiPriority="52"/>
-    <w:lsdException w:name="Grid Table 1 Light Accent 4" w:uiPriority="46"/>
-    <w:lsdException w:name="Grid Table 2 Accent 4" w:uiPriority="47"/>
-    <w:lsdException w:name="Grid Table 3 Accent 4" w:uiPriority="48"/>
-    <w:lsdException w:name="Grid Table 4 Accent 4" w:uiPriority="49"/>
-    <w:lsdException w:name="Grid Table 5 Dark Accent 4" w:uiPriority="50"/>
-    <w:lsdException w:name="Grid Table 6 Colorful Accent 4" w:uiPriority="51"/>
-    <w:lsdException w:name="Grid Table 7 Colorful Accent 4" w:uiPriority="52"/>
-    <w:lsdException w:name="Grid Table 1 Light Accent 5" w:uiPriority="46"/>
-    <w:lsdException w:name="Grid Table 2 Accent 5" w:uiPriority="47"/>
-    <w:lsdException w:name="Grid Table 3 Accent 5" w:uiPriority="48"/>
-    <w:lsdException w:name="Grid Table 4 Accent 5" w:uiPriority="49"/>
-    <w:lsdException w:name="Grid Table 5 Dark Accent 5" w:uiPriority="50"/>
-    <w:lsdException w:name="Grid Table 6 Colorful Accent 5" w:uiPriority="51"/>
-    <w:lsdException w:name="Grid Table 7 Colorful Accent 5" w:uiPriority="52"/>
-    <w:lsdException w:name="Grid Table 1 Light Accent 6" w:uiPriority="46"/>
-    <w:lsdException w:name="Grid Table 2 Accent 6" w:uiPriority="47"/>
-    <w:lsdException w:name="Grid Table 3 Accent 6" w:uiPriority="48"/>
-    <w:lsdException w:name="Grid Table 4 Accent 6" w:uiPriority="49"/>
-    <w:lsdException w:name="Grid Table 5 Dark Accent 6" w:uiPriority="50"/>
-    <w:lsdException w:name="Grid Table 6 Colorful Accent 6" w:uiPriority="51"/>
-    <w:lsdException w:name="Grid Table 7 Colorful Accent 6" w:uiPriority="52"/>
-    <w:lsdException w:name="List Table 1 Light" w:uiPriority="46"/>
-    <w:lsdException w:name="List Table 2" w:uiPriority="47"/>
-    <w:lsdException w:name="List Table 3" w:uiPriority="48"/>
-    <w:lsdException w:name="List Table 4" w:uiPriority="49"/>
-    <w:lsdException w:name="List Table 5 Dark" w:uiPriority="50"/>
-    <w:lsdException w:name="List Table 6 Colorful" w:uiPriority="51"/>
-    <w:lsdException w:name="List Table 7 Colorful" w:uiPriority="52"/>
-    <w:lsdException w:name="List Table 1 Light Accent 1" w:uiPriority="46"/>
-    <w:lsdException w:name="List Table 2 Accent 1" w:uiPriority="47"/>
-    <w:lsdException w:name="List Table 3 Accent 1" w:uiPriority="48"/>
-    <w:lsdException w:name="List Table 4 Accent 1" w:uiPriority="49"/>
-    <w:lsdException w:name="List Table 5 Dark Accent 1" w:uiPriority="50"/>
-    <w:lsdException w:name="List Table 6 Colorful Accent 1" w:uiPriority="51"/>
-    <w:lsdException w:name="List Table 7 Colorful Accent 1" w:uiPriority="52"/>
-    <w:lsdException w:name="List Table 1 Light Accent 2" w:uiPriority="46"/>
-    <w:lsdException w:name="List Table 2 Accent 2" w:uiPriority="47"/>
-    <w:lsdException w:name="List Table 3 Accent 2" w:uiPriority="48"/>
-    <w:lsdException w:name="List Table 4 Accent 2" w:uiPriority="49"/>
-    <w:lsdException w:name="List Table 5 Dark Accent 2" w:uiPriority="50"/>
-    <w:lsdException w:name="List Table 6 Colorful Accent 2" w:uiPriority="51"/>
-    <w:lsdException w:name="List Table 7 Colorful Accent 2" w:uiPriority="52"/>
-    <w:lsdException w:name="List Table 1 Light Accent 3" w:uiPriority="46"/>
-    <w:lsdException w:name="List Table 2 Accent 3" w:uiPriority="47"/>
-    <w:lsdException w:name="List Table 3 Accent 3" w:uiPriority="48"/>
-    <w:lsdException w:name="List Table 4 Accent 3" w:uiPriority="49"/>
-    <w:lsdException w:name="List Table 5 Dark Accent 3" w:uiPriority="50"/>
-    <w:lsdException w:name="List Table 6 Colorful Accent 3" w:uiPriority="51"/>
-    <w:lsdException w:name="List Table 7 Colorful Accent 3" w:uiPriority="52"/>
-    <w:lsdException w:name="List Table 1 Light Accent 4" w:uiPriority="46"/>
-    <w:lsdException w:name="List Table 2 Accent 4" w:uiPriority="47"/>
-    <w:lsdException w:name="List Table 3 Accent 4" w:uiPriority="48"/>
-    <w:lsdException w:name="List Table 4 Accent 4" w:uiPriority="49"/>
-    <w:lsdException w:name="List Table 5 Dark Accent 4" w:uiPriority="50"/>
-    <w:lsdException w:name="List Table 6 Colorful Accent 4" w:uiPriority="51"/>
-    <w:lsdException w:name="List Table 7 Colorful Accent 4" w:uiPriority="52"/>
-    <w:lsdException w:name="List Table 1 Light Accent 5" w:uiPriority="46"/>
-    <w:lsdException w:name="List Table 2 Accent 5" w:uiPriority="47"/>
-    <w:lsdException w:name="List Table 3 Accent 5" w:uiPriority="48"/>
-    <w:lsdException w:name="List Table 4 Accent 5" w:uiPriority="49"/>
-    <w:lsdException w:name="List Table 5 Dark Accent 5" w:uiPriority="50"/>
-    <w:lsdException w:name="List Table 6 Colorful Accent 5" w:uiPriority="51"/>
-    <w:lsdException w:name="List Table 7 Colorful Accent 5" w:uiPriority="52"/>
-    <w:lsdException w:name="List Table 1 Light Accent 6" w:uiPriority="46"/>
-    <w:lsdException w:name="List Table 2 Accent 6" w:uiPriority="47"/>
-    <w:lsdException w:name="List Table 3 Accent 6" w:uiPriority="48"/>
-    <w:lsdException w:name="List Table 4 Accent 6" w:uiPriority="49"/>
-    <w:lsdException w:name="List Table 5 Dark Accent 6" w:uiPriority="50"/>
-    <w:lsdException w:name="List Table 6 Colorful Accent 6" w:uiPriority="51"/>
-    <w:lsdException w:name="List Table 7 Colorful Accent 6" w:uiPriority="52"/>
-  </w:latentStyles>
-  <w:style w:type="paragraph" w:default="1" w:styleId="Normal">
-    <w:name w:val="Normal"/>
-    <w:qFormat/>
-  </w:style>
-  <w:style w:type="character" w:default="1" w:styleId="Fuentedeprrafopredeter">
-    <w:name w:val="Default Paragraph Font"/>
-    <w:uiPriority w:val="1"/>
-    <w:semiHidden/>
-    <w:unhideWhenUsed/>
-  </w:style>
-  <w:style w:type="table" w:default="1" w:styleId="Tablanormal">
-    <w:name w:val="Normal Table"/>
-    <w:uiPriority w:val="99"/>
-    <w:semiHidden/>
-    <w:unhideWhenUsed/>
-    <w:tblPr>
-      <w:tblInd w:w="0" w:type="dxa"/>
-      <w:tblCellMar>
-        <w:top w:w="0" w:type="dxa"/>
-        <w:left w:w="108" w:type="dxa"/>
-        <w:bottom w:w="0" w:type="dxa"/>
-        <w:right w:w="108" w:type="dxa"/>
-      </w:tblCellMar>
-    </w:tblPr>
-  </w:style>
-  <w:style w:type="numbering" w:default="1" w:styleId="Sinlista">
-    <w:name w:val="No List"/>
-    <w:uiPriority w:val="99"/>
-    <w:semiHidden/>
-    <w:unhideWhenUsed/>
-  </w:style>
-</w:styles>
-</file>
-
-<file path=word/glossary/webSettings.xml><?xml version="1.0" encoding="utf-8"?>
-<w:webSettings xmlns:mc="http://schemas.openxmlformats.org/markup-compatibility/2006" xmlns:r="http://schemas.openxmlformats.org/officeDocument/2006/relationships" xmlns:w="http://schemas.openxmlformats.org/wordprocessingml/2006/main" xmlns:w14="http://schemas.microsoft.com/office/word/2010/wordml" xmlns:w15="http://schemas.microsoft.com/office/word/2012/wordml" xmlns:w16se="http://schemas.microsoft.com/office/word/2015/wordml/symex" mc:Ignorable="w14 w15 w16se"/>
 </file>
 
 <file path=word/theme/theme1.xml><?xml version="1.0" encoding="utf-8"?>
@@ -9000,6 +8403,25 @@
 </file>
 
 <file path=customXml/item1.xml><?xml version="1.0" encoding="utf-8"?>
+<b:Sources xmlns:b="http://schemas.openxmlformats.org/officeDocument/2006/bibliography" xmlns="http://schemas.openxmlformats.org/officeDocument/2006/bibliography" SelectedStyle="\APASixthEditionOfficeOnline.xsl" StyleName="APA" Version="6"/>
+</file>
+
+<file path=customXml/item2.xml><?xml version="1.0" encoding="utf-8"?>
+<?mso-contentType ?>
+<FormTemplates xmlns="http://schemas.microsoft.com/sharepoint/v3/contenttype/forms">
+  <Display>DocumentLibraryForm</Display>
+  <Edit>DocumentLibraryForm</Edit>
+  <New>DocumentLibraryForm</New>
+</FormTemplates>
+</file>
+
+<file path=customXml/item3.xml><?xml version="1.0" encoding="utf-8"?>
+<p:properties xmlns:p="http://schemas.microsoft.com/office/2006/metadata/properties" xmlns:xsi="http://www.w3.org/2001/XMLSchema-instance" xmlns:pc="http://schemas.microsoft.com/office/infopath/2007/PartnerControls">
+  <documentManagement/>
+</p:properties>
+</file>
+
+<file path=customXml/item4.xml><?xml version="1.0" encoding="utf-8"?>
 <ct:contentTypeSchema xmlns:ct="http://schemas.microsoft.com/office/2006/metadata/contentType" xmlns:ma="http://schemas.microsoft.com/office/2006/metadata/properties/metaAttributes" ct:_="" ma:_="" ma:contentTypeName="Documento" ma:contentTypeID="0x010100E96778489EE7714D8BD12CC105EB918B" ma:contentTypeVersion="2" ma:contentTypeDescription="Crear nuevo documento." ma:contentTypeScope="" ma:versionID="416c5c7ae9b5d54d83875cd3c65194e3">
   <xsd:schema xmlns:xsd="http://www.w3.org/2001/XMLSchema" xmlns:xs="http://www.w3.org/2001/XMLSchema" xmlns:p="http://schemas.microsoft.com/office/2006/metadata/properties" xmlns:ns2="126e8a1c-9ea9-435a-ac89-d06c80d62e30" targetNamespace="http://schemas.microsoft.com/office/2006/metadata/properties" ma:root="true" ma:fieldsID="70a237c842677bd850644f8595079f5e" ns2:_="">
     <xsd:import namespace="126e8a1c-9ea9-435a-ac89-d06c80d62e30"/>
@@ -9131,26 +8553,32 @@
 </ct:contentTypeSchema>
 </file>
 
-<file path=customXml/item2.xml><?xml version="1.0" encoding="utf-8"?>
-<p:properties xmlns:p="http://schemas.microsoft.com/office/2006/metadata/properties" xmlns:xsi="http://www.w3.org/2001/XMLSchema-instance" xmlns:pc="http://schemas.microsoft.com/office/infopath/2007/PartnerControls">
-  <documentManagement/>
-</p:properties>
+<file path=customXml/itemProps1.xml><?xml version="1.0" encoding="utf-8"?>
+<ds:datastoreItem xmlns:ds="http://schemas.openxmlformats.org/officeDocument/2006/customXml" ds:itemID="{FBD61725-A60E-40F3-AB5D-0E7F797DD77D}">
+  <ds:schemaRefs>
+    <ds:schemaRef ds:uri="http://schemas.openxmlformats.org/officeDocument/2006/bibliography"/>
+  </ds:schemaRefs>
+</ds:datastoreItem>
 </file>
 
-<file path=customXml/item3.xml><?xml version="1.0" encoding="utf-8"?>
-<?mso-contentType ?>
-<FormTemplates xmlns="http://schemas.microsoft.com/sharepoint/v3/contenttype/forms">
-  <Display>DocumentLibraryForm</Display>
-  <Edit>DocumentLibraryForm</Edit>
-  <New>DocumentLibraryForm</New>
-</FormTemplates>
+<file path=customXml/itemProps2.xml><?xml version="1.0" encoding="utf-8"?>
+<ds:datastoreItem xmlns:ds="http://schemas.openxmlformats.org/officeDocument/2006/customXml" ds:itemID="{DABAA964-10BA-4DBC-ABF2-CDEAC0FAF7AA}">
+  <ds:schemaRefs>
+    <ds:schemaRef ds:uri="http://schemas.microsoft.com/sharepoint/v3/contenttype/forms"/>
+  </ds:schemaRefs>
+</ds:datastoreItem>
 </file>
 
-<file path=customXml/item4.xml><?xml version="1.0" encoding="utf-8"?>
-<b:Sources xmlns:b="http://schemas.openxmlformats.org/officeDocument/2006/bibliography" xmlns="http://schemas.openxmlformats.org/officeDocument/2006/bibliography" SelectedStyle="\APASixthEditionOfficeOnline.xsl" StyleName="APA" Version="6"/>
+<file path=customXml/itemProps3.xml><?xml version="1.0" encoding="utf-8"?>
+<ds:datastoreItem xmlns:ds="http://schemas.openxmlformats.org/officeDocument/2006/customXml" ds:itemID="{5F1783E3-BA1C-4CA3-8E32-C9B378BBED03}">
+  <ds:schemaRefs>
+    <ds:schemaRef ds:uri="http://schemas.microsoft.com/office/2006/metadata/properties"/>
+    <ds:schemaRef ds:uri="http://schemas.microsoft.com/office/infopath/2007/PartnerControls"/>
+  </ds:schemaRefs>
+</ds:datastoreItem>
 </file>
 
-<file path=customXml/itemProps1.xml><?xml version="1.0" encoding="utf-8"?>
+<file path=customXml/itemProps4.xml><?xml version="1.0" encoding="utf-8"?>
 <ds:datastoreItem xmlns:ds="http://schemas.openxmlformats.org/officeDocument/2006/customXml" ds:itemID="{DF0582E6-0C2C-40A6-8E3D-E410E41021C1}">
   <ds:schemaRefs>
     <ds:schemaRef ds:uri="http://schemas.microsoft.com/office/2006/metadata/contentType"/>
@@ -9166,36 +8594,4 @@
     <ds:schemaRef ds:uri="http://schemas.microsoft.com/internal/obd"/>
   </ds:schemaRefs>
 </ds:datastoreItem>
-</file>
-
-<file path=customXml/itemProps2.xml><?xml version="1.0" encoding="utf-8"?>
-<ds:datastoreItem xmlns:ds="http://schemas.openxmlformats.org/officeDocument/2006/customXml" ds:itemID="{5F1783E3-BA1C-4CA3-8E32-C9B378BBED03}">
-  <ds:schemaRefs>
-    <ds:schemaRef ds:uri="http://schemas.openxmlformats.org/package/2006/metadata/core-properties"/>
-    <ds:schemaRef ds:uri="http://schemas.microsoft.com/office/infopath/2007/PartnerControls"/>
-    <ds:schemaRef ds:uri="http://purl.org/dc/elements/1.1/"/>
-    <ds:schemaRef ds:uri="http://schemas.microsoft.com/office/2006/documentManagement/types"/>
-    <ds:schemaRef ds:uri="http://schemas.microsoft.com/office/2006/metadata/properties"/>
-    <ds:schemaRef ds:uri="126e8a1c-9ea9-435a-ac89-d06c80d62e30"/>
-    <ds:schemaRef ds:uri="http://purl.org/dc/terms/"/>
-    <ds:schemaRef ds:uri="http://purl.org/dc/dcmitype/"/>
-    <ds:schemaRef ds:uri="http://www.w3.org/XML/1998/namespace"/>
-  </ds:schemaRefs>
-</ds:datastoreItem>
-</file>
-
-<file path=customXml/itemProps3.xml><?xml version="1.0" encoding="utf-8"?>
-<ds:datastoreItem xmlns:ds="http://schemas.openxmlformats.org/officeDocument/2006/customXml" ds:itemID="{DABAA964-10BA-4DBC-ABF2-CDEAC0FAF7AA}">
-  <ds:schemaRefs>
-    <ds:schemaRef ds:uri="http://schemas.microsoft.com/sharepoint/v3/contenttype/forms"/>
-  </ds:schemaRefs>
-</ds:datastoreItem>
-</file>
-
-<file path=customXml/itemProps4.xml><?xml version="1.0" encoding="utf-8"?>
-<ds:datastoreItem xmlns:ds="http://schemas.openxmlformats.org/officeDocument/2006/customXml" ds:itemID="{FBD61725-A60E-40F3-AB5D-0E7F797DD77D}">
-  <ds:schemaRefs>
-    <ds:schemaRef ds:uri="http://schemas.openxmlformats.org/officeDocument/2006/bibliography"/>
-  </ds:schemaRefs>
-</ds:datastoreItem>
 </file>
</xml_diff>